<commit_message>
mit Abstract und Fazit und Ausblick
</commit_message>
<xml_diff>
--- a/Dokumentation.docx
+++ b/Dokumentation.docx
@@ -7,9 +7,170 @@
         <w:rPr>
           <w:sz w:val="22"/>
           <w:szCs w:val="22"/>
+        </w:rPr>
+      </w:pPr>
+      <w:r>
+        <w:rPr>
+          <w:sz w:val="22"/>
+          <w:szCs w:val="22"/>
+        </w:rPr>
+        <w:t xml:space="preserve">Dokumentation </w:t>
+      </w:r>
+    </w:p>
+    <w:p>
+      <w:pPr>
+        <w:rPr>
+          <w:sz w:val="22"/>
+          <w:szCs w:val="22"/>
+        </w:rPr>
+      </w:pPr>
+      <w:r>
+        <w:rPr>
+          <w:sz w:val="22"/>
+          <w:szCs w:val="22"/>
+        </w:rPr>
+        <w:t xml:space="preserve">1. </w:t>
+      </w:r>
+      <w:r>
+        <w:rPr>
+          <w:sz w:val="22"/>
+          <w:szCs w:val="22"/>
+        </w:rPr>
+        <w:t>kurzes Abstract</w:t>
+      </w:r>
+    </w:p>
+    <w:p>
+      <w:pPr>
+        <w:rPr>
+          <w:sz w:val="22"/>
+          <w:szCs w:val="22"/>
+        </w:rPr>
+      </w:pPr>
+      <w:r>
+        <w:rPr>
+          <w:sz w:val="22"/>
+          <w:szCs w:val="22"/>
+        </w:rPr>
+        <w:t xml:space="preserve">In unserem Medieninformatikprojekt “performativer Raum” haben wir </w:t>
+      </w:r>
+      <w:r>
+        <w:rPr>
+          <w:sz w:val="22"/>
+          <w:szCs w:val="22"/>
+        </w:rPr>
+        <w:t>damit befasst</w:t>
+      </w:r>
+      <w:r>
+        <w:rPr>
+          <w:sz w:val="22"/>
+          <w:szCs w:val="22"/>
+        </w:rPr>
+        <w:t xml:space="preserve">, </w:t>
+      </w:r>
+      <w:r>
+        <w:rPr>
+          <w:sz w:val="22"/>
+          <w:szCs w:val="22"/>
+        </w:rPr>
+        <w:t>das Konzept des „virtuellen Selbst“ durch eine Schattenprojektion räumlich erlebbar zu machen. Dabei erfasst unser System Besucher am Raumeingang mithilfe einer Azure Kinect.</w:t>
+      </w:r>
+      <w:r>
+        <w:rPr>
+          <w:sz w:val="22"/>
+          <w:szCs w:val="22"/>
+        </w:rPr>
+        <w:t xml:space="preserve"> Unser Python-Backend und p5.js-Frontend</w:t>
+      </w:r>
+      <w:r>
+        <w:rPr>
+          <w:sz w:val="22"/>
+          <w:szCs w:val="22"/>
+        </w:rPr>
+        <w:t xml:space="preserve"> wandelt dann ihre Bewegungen in farblich kodierte Geisterschatten um und projiziert diese</w:t>
+      </w:r>
+      <w:r>
+        <w:rPr>
+          <w:sz w:val="22"/>
+          <w:szCs w:val="22"/>
+        </w:rPr>
+        <w:t xml:space="preserve"> mithilfe eines </w:t>
+      </w:r>
+      <w:proofErr w:type="spellStart"/>
+      <w:r>
+        <w:rPr>
+          <w:sz w:val="22"/>
+          <w:szCs w:val="22"/>
+        </w:rPr>
+        <w:t>Beamer</w:t>
+      </w:r>
+      <w:r>
+        <w:rPr>
+          <w:sz w:val="22"/>
+          <w:szCs w:val="22"/>
+        </w:rPr>
+        <w:t>s</w:t>
+      </w:r>
+      <w:proofErr w:type="spellEnd"/>
+      <w:r>
+        <w:rPr>
+          <w:sz w:val="22"/>
+          <w:szCs w:val="22"/>
+        </w:rPr>
+        <w:t xml:space="preserve"> auf eine Wand</w:t>
+      </w:r>
+      <w:r>
+        <w:rPr>
+          <w:sz w:val="22"/>
+          <w:szCs w:val="22"/>
+        </w:rPr>
+        <w:t>. Nutzer können dadurch ihren Schatten später als virtuelles Selbst wiedererkennen. Gepaart mit Effekten</w:t>
+      </w:r>
+      <w:r>
+        <w:rPr>
+          <w:sz w:val="22"/>
+          <w:szCs w:val="22"/>
+        </w:rPr>
+        <w:t>,</w:t>
+      </w:r>
+      <w:r>
+        <w:rPr>
+          <w:sz w:val="22"/>
+          <w:szCs w:val="22"/>
+        </w:rPr>
+        <w:t xml:space="preserve"> wie dem langsamen Auflösen des Schattens bei längerem Verweilen, entsteht eine intuitive und dynamische Erfahrung. </w:t>
+      </w:r>
+      <w:r>
+        <w:rPr>
+          <w:sz w:val="22"/>
+          <w:szCs w:val="22"/>
+        </w:rPr>
+        <w:t xml:space="preserve">Besucher können somit im Raum entdecken, wie Ihr physisches Handeln Ihr digitales Abbild im Raum beeinflusst. </w:t>
+      </w:r>
+    </w:p>
+    <w:p>
+      <w:pPr>
+        <w:rPr>
+          <w:sz w:val="22"/>
+          <w:szCs w:val="22"/>
+        </w:rPr>
+      </w:pPr>
+    </w:p>
+    <w:p>
+      <w:pPr>
+        <w:rPr>
+          <w:sz w:val="22"/>
+          <w:szCs w:val="22"/>
           <w:lang w:val="en-US"/>
         </w:rPr>
       </w:pPr>
+      <w:r>
+        <w:rPr>
+          <w:sz w:val="22"/>
+          <w:szCs w:val="22"/>
+          <w:lang w:val="en-US"/>
+        </w:rPr>
+        <w:t xml:space="preserve">2. </w:t>
+      </w:r>
       <w:proofErr w:type="spellStart"/>
       <w:r>
         <w:rPr>
@@ -17,7 +178,7 @@
           <w:szCs w:val="22"/>
           <w:lang w:val="en-US"/>
         </w:rPr>
-        <w:t>Dokumentation</w:t>
+        <w:t>Einleitung</w:t>
       </w:r>
       <w:proofErr w:type="spellEnd"/>
       <w:r>
@@ -31,166 +192,920 @@
     </w:p>
     <w:p>
       <w:pPr>
-        <w:rPr>
-          <w:sz w:val="22"/>
-          <w:szCs w:val="22"/>
-          <w:lang w:val="en-US"/>
-        </w:rPr>
-      </w:pPr>
-      <w:r>
-        <w:rPr>
-          <w:sz w:val="22"/>
-          <w:szCs w:val="22"/>
-          <w:lang w:val="en-US"/>
-        </w:rPr>
-        <w:t xml:space="preserve">1. </w:t>
+        <w:pStyle w:val="Listenabsatz"/>
+        <w:numPr>
+          <w:ilvl w:val="0"/>
+          <w:numId w:val="1"/>
+        </w:numPr>
+        <w:rPr>
+          <w:sz w:val="22"/>
+          <w:szCs w:val="22"/>
+        </w:rPr>
+      </w:pPr>
+      <w:r>
+        <w:rPr>
+          <w:sz w:val="22"/>
+          <w:szCs w:val="22"/>
+        </w:rPr>
+        <w:t>Konzeptionsphase begann mit individuelle</w:t>
+      </w:r>
+      <w:r>
+        <w:rPr>
+          <w:sz w:val="22"/>
+          <w:szCs w:val="22"/>
+        </w:rPr>
+        <w:t>r</w:t>
+      </w:r>
+      <w:r>
+        <w:rPr>
+          <w:sz w:val="22"/>
+          <w:szCs w:val="22"/>
+        </w:rPr>
+        <w:t xml:space="preserve"> Erkundung der räumlichen Gegebenheiten </w:t>
+      </w:r>
+    </w:p>
+    <w:p>
+      <w:pPr>
+        <w:pStyle w:val="Listenabsatz"/>
+        <w:numPr>
+          <w:ilvl w:val="0"/>
+          <w:numId w:val="1"/>
+        </w:numPr>
+        <w:rPr>
+          <w:sz w:val="22"/>
+          <w:szCs w:val="22"/>
+        </w:rPr>
+      </w:pPr>
+      <w:r>
+        <w:rPr>
+          <w:sz w:val="22"/>
+          <w:szCs w:val="22"/>
+        </w:rPr>
+        <w:t xml:space="preserve">Noch vor Gruppenbildung stand Auseinandersetzung mit Raum und Objekten im Vordergrund </w:t>
+      </w:r>
+    </w:p>
+    <w:p>
+      <w:pPr>
+        <w:pStyle w:val="Listenabsatz"/>
+        <w:numPr>
+          <w:ilvl w:val="0"/>
+          <w:numId w:val="1"/>
+        </w:numPr>
+        <w:rPr>
+          <w:sz w:val="22"/>
+          <w:szCs w:val="22"/>
+        </w:rPr>
+      </w:pPr>
+      <w:r>
+        <w:rPr>
+          <w:sz w:val="22"/>
+          <w:szCs w:val="22"/>
+        </w:rPr>
+        <w:t xml:space="preserve">Erste Inhaltliche Orientierungspunkte bot kollaborative Sammlung auf Miro Board </w:t>
+      </w:r>
+    </w:p>
+    <w:p>
+      <w:pPr>
+        <w:pStyle w:val="Listenabsatz"/>
+        <w:numPr>
+          <w:ilvl w:val="0"/>
+          <w:numId w:val="1"/>
+        </w:numPr>
+        <w:rPr>
+          <w:sz w:val="22"/>
+          <w:szCs w:val="22"/>
+        </w:rPr>
+      </w:pPr>
+      <w:r>
+        <w:rPr>
+          <w:sz w:val="22"/>
+          <w:szCs w:val="22"/>
+        </w:rPr>
+        <w:t xml:space="preserve">-&gt; verschiedene Themenbereiche wurden </w:t>
+      </w:r>
+      <w:proofErr w:type="gramStart"/>
+      <w:r>
+        <w:rPr>
+          <w:sz w:val="22"/>
+          <w:szCs w:val="22"/>
+        </w:rPr>
+        <w:t>vorgestellt</w:t>
+      </w:r>
+      <w:proofErr w:type="gramEnd"/>
+      <w:r>
+        <w:rPr>
+          <w:sz w:val="22"/>
+          <w:szCs w:val="22"/>
+        </w:rPr>
+        <w:t xml:space="preserve"> um die Vielseitigkeit des Projekts und Raums zu zeigen</w:t>
+      </w:r>
+    </w:p>
+    <w:p>
+      <w:pPr>
+        <w:pStyle w:val="Listenabsatz"/>
+        <w:numPr>
+          <w:ilvl w:val="0"/>
+          <w:numId w:val="1"/>
+        </w:numPr>
+        <w:rPr>
+          <w:sz w:val="22"/>
+          <w:szCs w:val="22"/>
+        </w:rPr>
+      </w:pPr>
+      <w:r>
+        <w:rPr>
+          <w:sz w:val="22"/>
+          <w:szCs w:val="22"/>
+        </w:rPr>
+        <w:t>Besondere Aufmerksamkeit bei Thema „virtuellen Selbst“, was im Team weiter durch eigenständige Recherche ausgearbeitet wurde</w:t>
+      </w:r>
+    </w:p>
+    <w:p>
+      <w:pPr>
+        <w:pStyle w:val="Listenabsatz"/>
+        <w:numPr>
+          <w:ilvl w:val="0"/>
+          <w:numId w:val="1"/>
+        </w:numPr>
+        <w:rPr>
+          <w:sz w:val="22"/>
+          <w:szCs w:val="22"/>
+        </w:rPr>
+      </w:pPr>
+      <w:r>
+        <w:rPr>
+          <w:sz w:val="22"/>
+          <w:szCs w:val="22"/>
+        </w:rPr>
+        <w:t xml:space="preserve"> </w:t>
+      </w:r>
+      <w:r>
+        <w:rPr>
+          <w:sz w:val="22"/>
+          <w:szCs w:val="22"/>
+        </w:rPr>
+        <w:t xml:space="preserve">Im Zuge der weiteren Ideenfindung entstand erstes Konzept einer hybriden Installation </w:t>
+      </w:r>
+    </w:p>
+    <w:p>
+      <w:pPr>
+        <w:pStyle w:val="Listenabsatz"/>
+        <w:numPr>
+          <w:ilvl w:val="0"/>
+          <w:numId w:val="1"/>
+        </w:numPr>
+        <w:rPr>
+          <w:sz w:val="22"/>
+          <w:szCs w:val="22"/>
+        </w:rPr>
+      </w:pPr>
+      <w:r>
+        <w:rPr>
+          <w:sz w:val="22"/>
+          <w:szCs w:val="22"/>
+        </w:rPr>
+        <w:t xml:space="preserve">-&gt; virtuelles Selbst wird mit physischem Objekt, mitgebrachtes Schachbrett, verknüpft </w:t>
+      </w:r>
+    </w:p>
+    <w:p>
+      <w:pPr>
+        <w:pStyle w:val="Listenabsatz"/>
+        <w:numPr>
+          <w:ilvl w:val="0"/>
+          <w:numId w:val="1"/>
+        </w:numPr>
+        <w:rPr>
+          <w:sz w:val="22"/>
+          <w:szCs w:val="22"/>
+        </w:rPr>
+      </w:pPr>
+      <w:r>
+        <w:rPr>
+          <w:sz w:val="22"/>
+          <w:szCs w:val="22"/>
+        </w:rPr>
+        <w:t>Grundidee sah vor, dass Nutzer mit Schachbrett interagiert, während</w:t>
+      </w:r>
+      <w:r>
+        <w:rPr>
+          <w:sz w:val="22"/>
+          <w:szCs w:val="22"/>
+        </w:rPr>
+        <w:t xml:space="preserve"> sein projizierter Schatten an Wand seine verborgenen Emotionen offenbaren</w:t>
+      </w:r>
+    </w:p>
+    <w:p>
+      <w:pPr>
+        <w:pStyle w:val="Listenabsatz"/>
+        <w:numPr>
+          <w:ilvl w:val="0"/>
+          <w:numId w:val="1"/>
+        </w:numPr>
+        <w:rPr>
+          <w:sz w:val="22"/>
+          <w:szCs w:val="22"/>
+        </w:rPr>
+      </w:pPr>
+      <w:r>
+        <w:rPr>
+          <w:sz w:val="22"/>
+          <w:szCs w:val="22"/>
+        </w:rPr>
+        <w:t xml:space="preserve">Bspw.: bei schlechtem Schachzug, sollte Schatten mit Kopf schütteln, während reale Spieler sein Verhalten wahrt </w:t>
+      </w:r>
+    </w:p>
+    <w:p>
+      <w:pPr>
+        <w:pStyle w:val="Listenabsatz"/>
+        <w:numPr>
+          <w:ilvl w:val="0"/>
+          <w:numId w:val="1"/>
+        </w:numPr>
+        <w:rPr>
+          <w:sz w:val="22"/>
+          <w:szCs w:val="22"/>
+        </w:rPr>
+      </w:pPr>
+      <w:r>
+        <w:rPr>
+          <w:sz w:val="22"/>
+          <w:szCs w:val="22"/>
+        </w:rPr>
+        <w:t>Bei Ausarbeitung dieses Ansatzes zeigten sich konzeptionelle und technische Hürden</w:t>
+      </w:r>
+    </w:p>
+    <w:p>
+      <w:pPr>
+        <w:pStyle w:val="Listenabsatz"/>
+        <w:numPr>
+          <w:ilvl w:val="0"/>
+          <w:numId w:val="1"/>
+        </w:numPr>
+        <w:rPr>
+          <w:sz w:val="22"/>
+          <w:szCs w:val="22"/>
+        </w:rPr>
+      </w:pPr>
+      <w:r>
+        <w:rPr>
+          <w:sz w:val="22"/>
+          <w:szCs w:val="22"/>
+        </w:rPr>
+        <w:t xml:space="preserve">-&gt; Komplexität des genauen Trackings des Bretts und der Züge -&gt; Sprengung des Projekts </w:t>
+      </w:r>
+    </w:p>
+    <w:p>
+      <w:pPr>
+        <w:pStyle w:val="Listenabsatz"/>
+        <w:numPr>
+          <w:ilvl w:val="0"/>
+          <w:numId w:val="1"/>
+        </w:numPr>
+        <w:rPr>
+          <w:sz w:val="22"/>
+          <w:szCs w:val="22"/>
+        </w:rPr>
+      </w:pPr>
+      <w:r>
+        <w:rPr>
+          <w:sz w:val="22"/>
+          <w:szCs w:val="22"/>
+        </w:rPr>
+        <w:t xml:space="preserve">Außerdem Defizite im Raumkontext -&gt; die Installation fügte sich nicht nahtlos in die Umgebung des Raums und Setting widersprach Leitfaden einer intuitiven Raumerfahrung </w:t>
+      </w:r>
+    </w:p>
+    <w:p>
+      <w:pPr>
+        <w:pStyle w:val="Listenabsatz"/>
+        <w:numPr>
+          <w:ilvl w:val="0"/>
+          <w:numId w:val="1"/>
+        </w:numPr>
+        <w:rPr>
+          <w:sz w:val="22"/>
+          <w:szCs w:val="22"/>
+        </w:rPr>
+      </w:pPr>
+      <w:r>
+        <w:rPr>
+          <w:sz w:val="22"/>
+          <w:szCs w:val="22"/>
+        </w:rPr>
+        <w:t xml:space="preserve">Interaktion wäre erzwungen gewesen, da sich Teilnehmer aktiv ans Schachbrett setzen und spielen müssen </w:t>
+      </w:r>
+    </w:p>
+    <w:p>
+      <w:pPr>
+        <w:pStyle w:val="Listenabsatz"/>
+        <w:numPr>
+          <w:ilvl w:val="0"/>
+          <w:numId w:val="1"/>
+        </w:numPr>
+        <w:rPr>
+          <w:sz w:val="22"/>
+          <w:szCs w:val="22"/>
+        </w:rPr>
+      </w:pPr>
+      <w:r>
+        <w:rPr>
+          <w:sz w:val="22"/>
+          <w:szCs w:val="22"/>
+        </w:rPr>
+        <w:t xml:space="preserve">Diese Erkenntnisse führten zu bewusster Entscheidung zugunsten einer besseren impliziten Interaktion, welche sich auf das wesentliche konzentriert -&gt;unmittelbare Auseinandersetzung mit virtuellem Selbst </w:t>
+      </w:r>
+    </w:p>
+    <w:p>
+      <w:pPr>
+        <w:pStyle w:val="Listenabsatz"/>
+        <w:numPr>
+          <w:ilvl w:val="0"/>
+          <w:numId w:val="1"/>
+        </w:numPr>
+        <w:rPr>
+          <w:sz w:val="22"/>
+          <w:szCs w:val="22"/>
+        </w:rPr>
+      </w:pPr>
+      <w:r>
+        <w:rPr>
+          <w:sz w:val="22"/>
+          <w:szCs w:val="22"/>
+        </w:rPr>
+        <w:t xml:space="preserve">-&gt; Fokus erstmal vollständig auf Erfassung und Projektion der menschlichen Schatten mittels Kinect Kamera </w:t>
+      </w:r>
+    </w:p>
+    <w:p>
+      <w:pPr>
+        <w:rPr>
+          <w:sz w:val="22"/>
+          <w:szCs w:val="22"/>
+        </w:rPr>
+      </w:pPr>
+    </w:p>
+    <w:p>
+      <w:pPr>
+        <w:rPr>
+          <w:sz w:val="22"/>
+          <w:szCs w:val="22"/>
+        </w:rPr>
+      </w:pPr>
+      <w:r>
+        <w:rPr>
+          <w:sz w:val="22"/>
+          <w:szCs w:val="22"/>
+        </w:rPr>
+        <w:t xml:space="preserve">3. Konzept </w:t>
+      </w:r>
+    </w:p>
+    <w:p>
+      <w:pPr>
+        <w:pStyle w:val="Listenabsatz"/>
+        <w:numPr>
+          <w:ilvl w:val="0"/>
+          <w:numId w:val="2"/>
+        </w:numPr>
+        <w:rPr>
+          <w:sz w:val="22"/>
+          <w:szCs w:val="22"/>
+        </w:rPr>
+      </w:pPr>
+      <w:r>
+        <w:rPr>
+          <w:sz w:val="22"/>
+          <w:szCs w:val="22"/>
+        </w:rPr>
+        <w:t xml:space="preserve">Nach Verabschiedung der Schachbrett Idee -&gt; Aufmerksamkeit auf impliziter Interaktion, </w:t>
+      </w:r>
+      <w:r>
+        <w:rPr>
+          <w:sz w:val="22"/>
+          <w:szCs w:val="22"/>
+        </w:rPr>
+        <w:t xml:space="preserve">bei der das reine Betreten des Raums ausreicht, um Teil davon zu sein </w:t>
+      </w:r>
+    </w:p>
+    <w:p>
+      <w:pPr>
+        <w:pStyle w:val="Listenabsatz"/>
+        <w:numPr>
+          <w:ilvl w:val="0"/>
+          <w:numId w:val="2"/>
+        </w:numPr>
+        <w:rPr>
+          <w:sz w:val="22"/>
+          <w:szCs w:val="22"/>
+        </w:rPr>
+      </w:pPr>
+      <w:r>
+        <w:rPr>
+          <w:sz w:val="22"/>
+          <w:szCs w:val="22"/>
+        </w:rPr>
+        <w:lastRenderedPageBreak/>
+        <w:t xml:space="preserve">Teilnehmer sollen idealerweise im ersten Moment nicht merken, dass sie Schnittstelle bedienen </w:t>
+      </w:r>
+    </w:p>
+    <w:p>
+      <w:pPr>
+        <w:pStyle w:val="Listenabsatz"/>
+        <w:numPr>
+          <w:ilvl w:val="0"/>
+          <w:numId w:val="2"/>
+        </w:numPr>
+        <w:rPr>
+          <w:sz w:val="22"/>
+          <w:szCs w:val="22"/>
+        </w:rPr>
+      </w:pPr>
+      <w:r>
+        <w:rPr>
+          <w:sz w:val="22"/>
+          <w:szCs w:val="22"/>
+        </w:rPr>
+        <w:t xml:space="preserve">Es soll keine klassischen Eingabegeräte oder Tasten geben </w:t>
+      </w:r>
+    </w:p>
+    <w:p>
+      <w:pPr>
+        <w:pStyle w:val="Listenabsatz"/>
+        <w:numPr>
+          <w:ilvl w:val="0"/>
+          <w:numId w:val="2"/>
+        </w:numPr>
+        <w:rPr>
+          <w:sz w:val="22"/>
+          <w:szCs w:val="22"/>
+        </w:rPr>
+      </w:pPr>
+      <w:r>
+        <w:rPr>
+          <w:sz w:val="22"/>
+          <w:szCs w:val="22"/>
+        </w:rPr>
+        <w:t xml:space="preserve">Bloße Anwesenheit und natürliche Bewegungen dienen als direkter Input </w:t>
+      </w:r>
+    </w:p>
+    <w:p>
+      <w:pPr>
+        <w:pStyle w:val="Listenabsatz"/>
+        <w:numPr>
+          <w:ilvl w:val="0"/>
+          <w:numId w:val="2"/>
+        </w:numPr>
+        <w:rPr>
+          <w:sz w:val="22"/>
+          <w:szCs w:val="22"/>
+        </w:rPr>
+      </w:pPr>
+      <w:r>
+        <w:rPr>
+          <w:sz w:val="22"/>
+          <w:szCs w:val="22"/>
+        </w:rPr>
+        <w:t xml:space="preserve">Um Leitthema „virtuelles Selbst“ künstlerisch spannend umzusetzen </w:t>
+      </w:r>
+      <w:r>
+        <w:rPr>
+          <w:sz w:val="22"/>
+          <w:szCs w:val="22"/>
+        </w:rPr>
+        <w:t xml:space="preserve">-&gt; bewusste </w:t>
       </w:r>
       <w:proofErr w:type="spellStart"/>
       <w:r>
         <w:rPr>
           <w:sz w:val="22"/>
           <w:szCs w:val="22"/>
-          <w:lang w:val="en-US"/>
-        </w:rPr>
-        <w:t>kurzes</w:t>
+        </w:rPr>
+        <w:t>asynchrome</w:t>
       </w:r>
       <w:proofErr w:type="spellEnd"/>
       <w:r>
         <w:rPr>
           <w:sz w:val="22"/>
           <w:szCs w:val="22"/>
-          <w:lang w:val="en-US"/>
-        </w:rPr>
-        <w:t xml:space="preserve"> Abstract</w:t>
-      </w:r>
-    </w:p>
-    <w:p>
-      <w:pPr>
-        <w:rPr>
-          <w:sz w:val="22"/>
-          <w:szCs w:val="22"/>
-          <w:lang w:val="en-US"/>
-        </w:rPr>
-      </w:pPr>
-      <w:r>
-        <w:rPr>
-          <w:sz w:val="22"/>
-          <w:szCs w:val="22"/>
-          <w:lang w:val="en-US"/>
-        </w:rPr>
-        <w:t xml:space="preserve">2. </w:t>
+        </w:rPr>
+        <w:t xml:space="preserve"> Anordnung von Aufnahme- und Ausgabeort  </w:t>
+      </w:r>
+    </w:p>
+    <w:p>
+      <w:pPr>
+        <w:pStyle w:val="Listenabsatz"/>
+        <w:numPr>
+          <w:ilvl w:val="0"/>
+          <w:numId w:val="2"/>
+        </w:numPr>
+        <w:rPr>
+          <w:sz w:val="22"/>
+          <w:szCs w:val="22"/>
+        </w:rPr>
+      </w:pPr>
+      <w:r>
+        <w:rPr>
+          <w:sz w:val="22"/>
+          <w:szCs w:val="22"/>
+        </w:rPr>
+        <w:t>Kamera nimmt Person am Eingang auf, während die Projektion auf der entgegengesetzten Seite stattfindet</w:t>
+      </w:r>
+      <w:r>
+        <w:rPr>
+          <w:sz w:val="22"/>
+          <w:szCs w:val="22"/>
+        </w:rPr>
+        <w:t xml:space="preserve"> -&gt; </w:t>
+      </w:r>
+      <w:r>
+        <w:rPr>
+          <w:sz w:val="22"/>
+          <w:szCs w:val="22"/>
+        </w:rPr>
+        <w:t>Durch Trennung entsteht Entfremdungseffekt</w:t>
+      </w:r>
+    </w:p>
+    <w:p>
+      <w:pPr>
+        <w:pStyle w:val="Listenabsatz"/>
+        <w:numPr>
+          <w:ilvl w:val="0"/>
+          <w:numId w:val="2"/>
+        </w:numPr>
+        <w:rPr>
+          <w:sz w:val="22"/>
+          <w:szCs w:val="22"/>
+        </w:rPr>
+      </w:pPr>
+      <w:proofErr w:type="gramStart"/>
+      <w:r>
+        <w:rPr>
+          <w:sz w:val="22"/>
+          <w:szCs w:val="22"/>
+        </w:rPr>
+        <w:t>Bei visuellen Darstellung</w:t>
+      </w:r>
+      <w:proofErr w:type="gramEnd"/>
+      <w:r>
+        <w:rPr>
+          <w:sz w:val="22"/>
+          <w:szCs w:val="22"/>
+        </w:rPr>
+        <w:t xml:space="preserve"> der Schatten haben wir wichtigen iterativen Prozess durchlaufen </w:t>
+      </w:r>
+    </w:p>
+    <w:p>
+      <w:pPr>
+        <w:pStyle w:val="Listenabsatz"/>
+        <w:numPr>
+          <w:ilvl w:val="0"/>
+          <w:numId w:val="2"/>
+        </w:numPr>
+        <w:rPr>
+          <w:sz w:val="22"/>
+          <w:szCs w:val="22"/>
+        </w:rPr>
+      </w:pPr>
+      <w:r>
+        <w:rPr>
+          <w:sz w:val="22"/>
+          <w:szCs w:val="22"/>
+        </w:rPr>
+        <w:t xml:space="preserve">-&gt; Unser erster Ansatz: einzelne Frames der erfassten Person speichern, </w:t>
       </w:r>
       <w:proofErr w:type="spellStart"/>
       <w:r>
         <w:rPr>
           <w:sz w:val="22"/>
           <w:szCs w:val="22"/>
-          <w:lang w:val="en-US"/>
-        </w:rPr>
-        <w:t>Einleitung</w:t>
+        </w:rPr>
+        <w:t>soabald</w:t>
       </w:r>
       <w:proofErr w:type="spellEnd"/>
       <w:r>
         <w:rPr>
           <w:sz w:val="22"/>
           <w:szCs w:val="22"/>
-          <w:lang w:val="en-US"/>
+        </w:rPr>
+        <w:t xml:space="preserve"> jmd. Im Sichtfeld der Kamera ist </w:t>
+      </w:r>
+    </w:p>
+    <w:p>
+      <w:pPr>
+        <w:pStyle w:val="Listenabsatz"/>
+        <w:numPr>
+          <w:ilvl w:val="0"/>
+          <w:numId w:val="2"/>
+        </w:numPr>
+        <w:rPr>
+          <w:sz w:val="22"/>
+          <w:szCs w:val="22"/>
+        </w:rPr>
+      </w:pPr>
+      <w:r>
+        <w:rPr>
+          <w:sz w:val="22"/>
+          <w:szCs w:val="22"/>
+        </w:rPr>
+        <w:t xml:space="preserve">Diese Frames sollten dann zufällig auf der Projektionsfläche erscheinen und wieder verschwinden </w:t>
+      </w:r>
+    </w:p>
+    <w:p>
+      <w:pPr>
+        <w:pStyle w:val="Listenabsatz"/>
+        <w:numPr>
+          <w:ilvl w:val="0"/>
+          <w:numId w:val="2"/>
+        </w:numPr>
+        <w:rPr>
+          <w:sz w:val="22"/>
+          <w:szCs w:val="22"/>
+        </w:rPr>
+      </w:pPr>
+      <w:r>
+        <w:rPr>
+          <w:sz w:val="22"/>
+          <w:szCs w:val="22"/>
+        </w:rPr>
+        <w:t xml:space="preserve">Grundidee dahinter war es der Installation ein Gedächtnis zu geben </w:t>
+      </w:r>
+    </w:p>
+    <w:p>
+      <w:pPr>
+        <w:pStyle w:val="Listenabsatz"/>
+        <w:numPr>
+          <w:ilvl w:val="0"/>
+          <w:numId w:val="2"/>
+        </w:numPr>
+        <w:rPr>
+          <w:sz w:val="22"/>
+          <w:szCs w:val="22"/>
+        </w:rPr>
+      </w:pPr>
+      <w:r>
+        <w:rPr>
+          <w:sz w:val="22"/>
+          <w:szCs w:val="22"/>
+        </w:rPr>
+        <w:t>-&gt; wer interagiert, hinterlässt eine Spur und wird zum Teil des performativen Raums</w:t>
+      </w:r>
+    </w:p>
+    <w:p>
+      <w:pPr>
+        <w:pStyle w:val="Listenabsatz"/>
+        <w:numPr>
+          <w:ilvl w:val="0"/>
+          <w:numId w:val="2"/>
+        </w:numPr>
+        <w:rPr>
+          <w:sz w:val="22"/>
+          <w:szCs w:val="22"/>
+        </w:rPr>
+      </w:pPr>
+      <w:r>
+        <w:rPr>
+          <w:sz w:val="22"/>
+          <w:szCs w:val="22"/>
+        </w:rPr>
+        <w:t xml:space="preserve">Technisch hat der Ansatz funktioniert, aber wir waren mit visueller Wirkung unzufrieden </w:t>
+      </w:r>
+    </w:p>
+    <w:p>
+      <w:pPr>
+        <w:pStyle w:val="Listenabsatz"/>
+        <w:numPr>
+          <w:ilvl w:val="0"/>
+          <w:numId w:val="2"/>
+        </w:numPr>
+        <w:rPr>
+          <w:sz w:val="22"/>
+          <w:szCs w:val="22"/>
+        </w:rPr>
+      </w:pPr>
+      <w:r>
+        <w:rPr>
+          <w:sz w:val="22"/>
+          <w:szCs w:val="22"/>
+        </w:rPr>
+        <w:t xml:space="preserve">Einzelne Frames haben oft unvorteilhafte Momente gespeichert, wirkten eingefroren und passte ästhetisch nicht gut ins Bild </w:t>
+      </w:r>
+    </w:p>
+    <w:p>
+      <w:pPr>
+        <w:pStyle w:val="Listenabsatz"/>
+        <w:numPr>
+          <w:ilvl w:val="0"/>
+          <w:numId w:val="2"/>
+        </w:numPr>
+        <w:rPr>
+          <w:sz w:val="22"/>
+          <w:szCs w:val="22"/>
+        </w:rPr>
+      </w:pPr>
+      <w:r>
+        <w:rPr>
+          <w:sz w:val="22"/>
+          <w:szCs w:val="22"/>
+        </w:rPr>
+        <w:t xml:space="preserve">Auch Interaktion hat nicht profitiert, sondern fühlte sich starr an </w:t>
+      </w:r>
+    </w:p>
+    <w:p>
+      <w:pPr>
+        <w:pStyle w:val="Listenabsatz"/>
+        <w:numPr>
+          <w:ilvl w:val="0"/>
+          <w:numId w:val="2"/>
+        </w:numPr>
+        <w:rPr>
+          <w:sz w:val="22"/>
+          <w:szCs w:val="22"/>
+        </w:rPr>
+      </w:pPr>
+      <w:r>
+        <w:rPr>
+          <w:sz w:val="22"/>
+          <w:szCs w:val="22"/>
+        </w:rPr>
+        <w:t xml:space="preserve">Weiteres Problem: man konnte sich in einem einzelnen Frame oft schwer wiedererkennen, wodurch Bezug zum virtuellen Selbst verloren ging </w:t>
+      </w:r>
+    </w:p>
+    <w:p>
+      <w:pPr>
+        <w:pStyle w:val="Listenabsatz"/>
+        <w:numPr>
+          <w:ilvl w:val="0"/>
+          <w:numId w:val="2"/>
+        </w:numPr>
+        <w:rPr>
+          <w:sz w:val="22"/>
+          <w:szCs w:val="22"/>
+        </w:rPr>
+      </w:pPr>
+      <w:r>
+        <w:rPr>
+          <w:sz w:val="22"/>
+          <w:szCs w:val="22"/>
+        </w:rPr>
+        <w:t xml:space="preserve">Durchbruch dann mit Idee der Erweiterung von Frames auf </w:t>
+      </w:r>
+      <w:r>
+        <w:rPr>
+          <w:sz w:val="22"/>
+          <w:szCs w:val="22"/>
+        </w:rPr>
+        <w:t xml:space="preserve">ganze Bewegungssequenzen </w:t>
+      </w:r>
+    </w:p>
+    <w:p>
+      <w:pPr>
+        <w:pStyle w:val="Listenabsatz"/>
+        <w:numPr>
+          <w:ilvl w:val="0"/>
+          <w:numId w:val="2"/>
+        </w:numPr>
+        <w:rPr>
+          <w:sz w:val="22"/>
+          <w:szCs w:val="22"/>
+        </w:rPr>
+      </w:pPr>
+      <w:r>
+        <w:rPr>
+          <w:sz w:val="22"/>
+          <w:szCs w:val="22"/>
+        </w:rPr>
+        <w:t xml:space="preserve">Wenn ein Teilnehmer nun winkt, springt oder einfach vorbeigeht, wird dieser komplette Ablauf gesichert, wodurch sich Teilnehmer durch die Dynamik der Bewegung besser wiedererkennen </w:t>
+      </w:r>
+    </w:p>
+    <w:p>
+      <w:pPr>
+        <w:pStyle w:val="Listenabsatz"/>
+        <w:numPr>
+          <w:ilvl w:val="0"/>
+          <w:numId w:val="2"/>
+        </w:numPr>
+        <w:rPr>
+          <w:sz w:val="22"/>
+          <w:szCs w:val="22"/>
+        </w:rPr>
+      </w:pPr>
+      <w:r>
+        <w:rPr>
+          <w:sz w:val="22"/>
+          <w:szCs w:val="22"/>
+        </w:rPr>
+        <w:t>Das gespeicherte Winken taucht später, als eigenständiger „Ghost-Schatten“</w:t>
+      </w:r>
+      <w:r>
+        <w:rPr>
+          <w:sz w:val="22"/>
+          <w:szCs w:val="22"/>
         </w:rPr>
         <w:t xml:space="preserve"> </w:t>
       </w:r>
-    </w:p>
-    <w:p>
-      <w:pPr>
-        <w:pStyle w:val="Listenabsatz"/>
-        <w:numPr>
-          <w:ilvl w:val="0"/>
-          <w:numId w:val="1"/>
-        </w:numPr>
-        <w:rPr>
-          <w:sz w:val="22"/>
-          <w:szCs w:val="22"/>
-        </w:rPr>
-      </w:pPr>
-      <w:r>
-        <w:rPr>
-          <w:sz w:val="22"/>
-          <w:szCs w:val="22"/>
-        </w:rPr>
-        <w:t>Konzeptionsphase begann mit individuelle</w:t>
-      </w:r>
-      <w:r>
-        <w:rPr>
-          <w:sz w:val="22"/>
-          <w:szCs w:val="22"/>
-        </w:rPr>
-        <w:t>r</w:t>
-      </w:r>
-      <w:r>
-        <w:rPr>
-          <w:sz w:val="22"/>
-          <w:szCs w:val="22"/>
-        </w:rPr>
-        <w:t xml:space="preserve"> Erkundung der räumlichen Gegebenheiten </w:t>
-      </w:r>
-    </w:p>
-    <w:p>
-      <w:pPr>
-        <w:pStyle w:val="Listenabsatz"/>
-        <w:numPr>
-          <w:ilvl w:val="0"/>
-          <w:numId w:val="1"/>
-        </w:numPr>
-        <w:rPr>
-          <w:sz w:val="22"/>
-          <w:szCs w:val="22"/>
-        </w:rPr>
-      </w:pPr>
-      <w:r>
-        <w:rPr>
-          <w:sz w:val="22"/>
-          <w:szCs w:val="22"/>
-        </w:rPr>
-        <w:t xml:space="preserve">Noch vor Gruppenbildung stand Auseinandersetzung mit Raum und Objekten im Vordergrund </w:t>
-      </w:r>
-    </w:p>
-    <w:p>
-      <w:pPr>
-        <w:pStyle w:val="Listenabsatz"/>
-        <w:numPr>
-          <w:ilvl w:val="0"/>
-          <w:numId w:val="1"/>
-        </w:numPr>
-        <w:rPr>
-          <w:sz w:val="22"/>
-          <w:szCs w:val="22"/>
-        </w:rPr>
-      </w:pPr>
-      <w:r>
-        <w:rPr>
-          <w:sz w:val="22"/>
-          <w:szCs w:val="22"/>
-        </w:rPr>
-        <w:t xml:space="preserve">Erste Inhaltliche Orientierungspunkte bot kollaborative Sammlung auf Miro Board </w:t>
-      </w:r>
-    </w:p>
-    <w:p>
-      <w:pPr>
-        <w:pStyle w:val="Listenabsatz"/>
-        <w:numPr>
-          <w:ilvl w:val="0"/>
-          <w:numId w:val="1"/>
-        </w:numPr>
-        <w:rPr>
-          <w:sz w:val="22"/>
-          <w:szCs w:val="22"/>
-        </w:rPr>
-      </w:pPr>
-      <w:r>
-        <w:rPr>
-          <w:sz w:val="22"/>
-          <w:szCs w:val="22"/>
-        </w:rPr>
-        <w:t xml:space="preserve">-&gt; verschiedene Themenbereiche wurden </w:t>
+      <w:r>
+        <w:rPr>
+          <w:sz w:val="22"/>
+          <w:szCs w:val="22"/>
+        </w:rPr>
+        <w:t>wieder an der Wand auf -&gt; Prinzip des räumlichen Gedächtnisses bleibt erhalten, wird aber deutlich intensiver</w:t>
+      </w:r>
+    </w:p>
+    <w:p>
+      <w:pPr>
+        <w:pStyle w:val="Listenabsatz"/>
+        <w:numPr>
+          <w:ilvl w:val="0"/>
+          <w:numId w:val="2"/>
+        </w:numPr>
+        <w:rPr>
+          <w:sz w:val="22"/>
+          <w:szCs w:val="22"/>
+        </w:rPr>
+      </w:pPr>
+      <w:r>
+        <w:rPr>
+          <w:sz w:val="22"/>
+          <w:szCs w:val="22"/>
+        </w:rPr>
+        <w:t xml:space="preserve"> Um Gedächtnis visuell weiter zu verstärken und die Sequenzen besser voneinander abzugrenzen, besitzt jede wiedergegebene Schattensequenz eine eigene Farbe </w:t>
+      </w:r>
+    </w:p>
+    <w:p>
+      <w:pPr>
+        <w:pStyle w:val="Listenabsatz"/>
+        <w:numPr>
+          <w:ilvl w:val="0"/>
+          <w:numId w:val="2"/>
+        </w:numPr>
+        <w:rPr>
+          <w:sz w:val="22"/>
+          <w:szCs w:val="22"/>
+        </w:rPr>
+      </w:pPr>
+      <w:r>
+        <w:rPr>
+          <w:sz w:val="22"/>
+          <w:szCs w:val="22"/>
+        </w:rPr>
+        <w:t xml:space="preserve">Dadurch können Besucher Ihren Schatten noch deutlicher von anderen unterscheiden und das Gesamtbild wird lebendiger </w:t>
+      </w:r>
+    </w:p>
+    <w:p>
+      <w:pPr>
+        <w:pStyle w:val="Listenabsatz"/>
+        <w:numPr>
+          <w:ilvl w:val="0"/>
+          <w:numId w:val="2"/>
+        </w:numPr>
+        <w:rPr>
+          <w:sz w:val="22"/>
+          <w:szCs w:val="22"/>
+        </w:rPr>
+      </w:pPr>
+      <w:r>
+        <w:rPr>
+          <w:sz w:val="22"/>
+          <w:szCs w:val="22"/>
+        </w:rPr>
+        <w:t xml:space="preserve">Zusätzlich haben wir noch eine weitere Interaktion für die Schatten implementiert </w:t>
+      </w:r>
+    </w:p>
+    <w:p>
+      <w:pPr>
+        <w:pStyle w:val="Listenabsatz"/>
+        <w:numPr>
+          <w:ilvl w:val="0"/>
+          <w:numId w:val="2"/>
+        </w:numPr>
+        <w:rPr>
+          <w:sz w:val="22"/>
+          <w:szCs w:val="22"/>
+        </w:rPr>
+      </w:pPr>
+      <w:r>
+        <w:rPr>
+          <w:sz w:val="22"/>
+          <w:szCs w:val="22"/>
+        </w:rPr>
+        <w:t xml:space="preserve">Wenn eine Person zu lange im Visier der Kamera bleibt, löst sich der Schatten von selbst irgendwann auf </w:t>
+      </w:r>
+    </w:p>
+    <w:p>
+      <w:pPr>
+        <w:pStyle w:val="Listenabsatz"/>
+        <w:numPr>
+          <w:ilvl w:val="0"/>
+          <w:numId w:val="2"/>
+        </w:numPr>
+        <w:rPr>
+          <w:sz w:val="22"/>
+          <w:szCs w:val="22"/>
+        </w:rPr>
+      </w:pPr>
+      <w:r>
+        <w:rPr>
+          <w:sz w:val="22"/>
+          <w:szCs w:val="22"/>
+        </w:rPr>
+        <w:t>Diese Mechanik 2 Vorteile gleichzeitig: verhindert, dass das System durch Dauerpräsenz visuell blockiert wird (</w:t>
       </w:r>
       <w:proofErr w:type="gramStart"/>
       <w:r>
@@ -198,7 +1113,7 @@
           <w:sz w:val="22"/>
           <w:szCs w:val="22"/>
         </w:rPr>
-        <w:t>vorgestellt</w:t>
+        <w:t>beispielsweise</w:t>
       </w:r>
       <w:proofErr w:type="gramEnd"/>
       <w:r>
@@ -206,41 +1121,117 @@
           <w:sz w:val="22"/>
           <w:szCs w:val="22"/>
         </w:rPr>
-        <w:t xml:space="preserve"> um die Vielseitigkeit des Projekts und Raums zu zeigen</w:t>
-      </w:r>
-    </w:p>
-    <w:p>
-      <w:pPr>
-        <w:pStyle w:val="Listenabsatz"/>
-        <w:numPr>
-          <w:ilvl w:val="0"/>
-          <w:numId w:val="1"/>
-        </w:numPr>
-        <w:rPr>
-          <w:sz w:val="22"/>
-          <w:szCs w:val="22"/>
-        </w:rPr>
-      </w:pPr>
-      <w:r>
-        <w:rPr>
-          <w:sz w:val="22"/>
-          <w:szCs w:val="22"/>
-        </w:rPr>
-        <w:t>Besondere Aufmerksamkeit bei Thema „virtuellen Selbst“, was im Team weiter durch eigenständige Recherche ausgearbeitet wurde</w:t>
-      </w:r>
-    </w:p>
-    <w:p>
-      <w:pPr>
-        <w:pStyle w:val="Listenabsatz"/>
-        <w:numPr>
-          <w:ilvl w:val="0"/>
-          <w:numId w:val="1"/>
-        </w:numPr>
-        <w:rPr>
-          <w:sz w:val="22"/>
-          <w:szCs w:val="22"/>
-        </w:rPr>
-      </w:pPr>
+        <w:t xml:space="preserve"> wenn sich jemand ununterbrochen vor die Kameralinse stellt) und es fügt sich perfekt in die Idee des performativen Raums ein, da es Teilnehmer subtil dazu motiviert, den Eingangsbereich zügig wieder freizugeben und sich weiter in den Raum hineinzubewegen </w:t>
+      </w:r>
+    </w:p>
+    <w:p>
+      <w:pPr>
+        <w:rPr>
+          <w:sz w:val="22"/>
+          <w:szCs w:val="22"/>
+        </w:rPr>
+      </w:pPr>
+    </w:p>
+    <w:p>
+      <w:pPr>
+        <w:rPr>
+          <w:sz w:val="22"/>
+          <w:szCs w:val="22"/>
+        </w:rPr>
+      </w:pPr>
+      <w:r>
+        <w:rPr>
+          <w:sz w:val="22"/>
+          <w:szCs w:val="22"/>
+        </w:rPr>
+        <w:t>4. Umsetzung (Technische Umsetzung: Hardware + Software)</w:t>
+      </w:r>
+    </w:p>
+    <w:p>
+      <w:pPr>
+        <w:pStyle w:val="Listenabsatz"/>
+        <w:numPr>
+          <w:ilvl w:val="0"/>
+          <w:numId w:val="4"/>
+        </w:numPr>
+        <w:rPr>
+          <w:sz w:val="22"/>
+          <w:szCs w:val="22"/>
+        </w:rPr>
+      </w:pPr>
+      <w:r>
+        <w:rPr>
+          <w:sz w:val="22"/>
+          <w:szCs w:val="22"/>
+        </w:rPr>
+        <w:t xml:space="preserve">Für technische Umsetzung haben wir uns für geteilte Architektur entschieden </w:t>
+      </w:r>
+    </w:p>
+    <w:p>
+      <w:pPr>
+        <w:pStyle w:val="Listenabsatz"/>
+        <w:numPr>
+          <w:ilvl w:val="0"/>
+          <w:numId w:val="4"/>
+        </w:numPr>
+        <w:rPr>
+          <w:sz w:val="22"/>
+          <w:szCs w:val="22"/>
+        </w:rPr>
+      </w:pPr>
+      <w:r>
+        <w:rPr>
+          <w:sz w:val="22"/>
+          <w:szCs w:val="22"/>
+        </w:rPr>
+        <w:lastRenderedPageBreak/>
+        <w:t xml:space="preserve">Die hardwarenahe Sensorik und Datenaufbereitung läuft über Python-Backend, während visuelle Aufbereitung, das Speichermanagement und das Echtzeit Rendering in p5js Frontend im Webbrowser abgewickelt wird </w:t>
+      </w:r>
+    </w:p>
+    <w:p>
+      <w:pPr>
+        <w:pStyle w:val="Listenabsatz"/>
+        <w:numPr>
+          <w:ilvl w:val="0"/>
+          <w:numId w:val="4"/>
+        </w:numPr>
+        <w:rPr>
+          <w:sz w:val="22"/>
+          <w:szCs w:val="22"/>
+        </w:rPr>
+      </w:pPr>
+      <w:r>
+        <w:rPr>
+          <w:sz w:val="22"/>
+          <w:szCs w:val="22"/>
+        </w:rPr>
+        <w:t xml:space="preserve">Beide Systeme kommunizieren </w:t>
+      </w:r>
+      <w:proofErr w:type="spellStart"/>
+      <w:r>
+        <w:rPr>
+          <w:sz w:val="22"/>
+          <w:szCs w:val="22"/>
+        </w:rPr>
+        <w:t>asynchrom</w:t>
+      </w:r>
+      <w:proofErr w:type="spellEnd"/>
+      <w:r>
+        <w:rPr>
+          <w:sz w:val="22"/>
+          <w:szCs w:val="22"/>
+        </w:rPr>
+        <w:t xml:space="preserve"> über </w:t>
+      </w:r>
+      <w:proofErr w:type="spellStart"/>
+      <w:r>
+        <w:rPr>
+          <w:sz w:val="22"/>
+          <w:szCs w:val="22"/>
+        </w:rPr>
+        <w:t>Websockets</w:t>
+      </w:r>
+      <w:proofErr w:type="spellEnd"/>
       <w:r>
         <w:rPr>
           <w:sz w:val="22"/>
@@ -248,336 +1239,80 @@
         </w:rPr>
         <w:t xml:space="preserve"> </w:t>
       </w:r>
-      <w:r>
-        <w:rPr>
-          <w:sz w:val="22"/>
-          <w:szCs w:val="22"/>
-        </w:rPr>
-        <w:t xml:space="preserve">Im Zuge der weiteren Ideenfindung entstand erstes Konzept einer hybriden Installation </w:t>
-      </w:r>
-    </w:p>
-    <w:p>
-      <w:pPr>
-        <w:pStyle w:val="Listenabsatz"/>
-        <w:numPr>
-          <w:ilvl w:val="0"/>
-          <w:numId w:val="1"/>
-        </w:numPr>
-        <w:rPr>
-          <w:sz w:val="22"/>
-          <w:szCs w:val="22"/>
-        </w:rPr>
-      </w:pPr>
-      <w:r>
-        <w:rPr>
-          <w:sz w:val="22"/>
-          <w:szCs w:val="22"/>
-        </w:rPr>
-        <w:t xml:space="preserve">-&gt; virtuelles Selbst wird mit physischem Objekt, mitgebrachtes Schachbrett, verknüpft </w:t>
-      </w:r>
-    </w:p>
-    <w:p>
-      <w:pPr>
-        <w:pStyle w:val="Listenabsatz"/>
-        <w:numPr>
-          <w:ilvl w:val="0"/>
-          <w:numId w:val="1"/>
-        </w:numPr>
-        <w:rPr>
-          <w:sz w:val="22"/>
-          <w:szCs w:val="22"/>
-        </w:rPr>
-      </w:pPr>
-      <w:r>
-        <w:rPr>
-          <w:sz w:val="22"/>
-          <w:szCs w:val="22"/>
-        </w:rPr>
-        <w:t>Grundidee sah vor, dass Nutzer mit Schachbrett interagiert, während</w:t>
-      </w:r>
-      <w:r>
-        <w:rPr>
-          <w:sz w:val="22"/>
-          <w:szCs w:val="22"/>
-        </w:rPr>
-        <w:t xml:space="preserve"> sein projizierter Schatten an Wand seine verborgenen Emotionen offenbaren</w:t>
-      </w:r>
-    </w:p>
-    <w:p>
-      <w:pPr>
-        <w:pStyle w:val="Listenabsatz"/>
-        <w:numPr>
-          <w:ilvl w:val="0"/>
-          <w:numId w:val="1"/>
-        </w:numPr>
-        <w:rPr>
-          <w:sz w:val="22"/>
-          <w:szCs w:val="22"/>
-        </w:rPr>
-      </w:pPr>
-      <w:r>
-        <w:rPr>
-          <w:sz w:val="22"/>
-          <w:szCs w:val="22"/>
-        </w:rPr>
-        <w:t xml:space="preserve">Bspw.: bei schlechtem Schachzug, sollte Schatten mit Kopf schütteln, während reale Spieler sein Verhalten wahrt </w:t>
-      </w:r>
-    </w:p>
-    <w:p>
-      <w:pPr>
-        <w:pStyle w:val="Listenabsatz"/>
-        <w:numPr>
-          <w:ilvl w:val="0"/>
-          <w:numId w:val="1"/>
-        </w:numPr>
-        <w:rPr>
-          <w:sz w:val="22"/>
-          <w:szCs w:val="22"/>
-        </w:rPr>
-      </w:pPr>
-      <w:r>
-        <w:rPr>
-          <w:sz w:val="22"/>
-          <w:szCs w:val="22"/>
-        </w:rPr>
-        <w:t>Bei Ausarbeitung dieses Ansatzes zeigten sich konzeptionelle und technische Hürden</w:t>
-      </w:r>
-    </w:p>
-    <w:p>
-      <w:pPr>
-        <w:pStyle w:val="Listenabsatz"/>
-        <w:numPr>
-          <w:ilvl w:val="0"/>
-          <w:numId w:val="1"/>
-        </w:numPr>
-        <w:rPr>
-          <w:sz w:val="22"/>
-          <w:szCs w:val="22"/>
-        </w:rPr>
-      </w:pPr>
-      <w:r>
-        <w:rPr>
-          <w:sz w:val="22"/>
-          <w:szCs w:val="22"/>
-        </w:rPr>
-        <w:t xml:space="preserve">-&gt; Komplexität des genauen Trackings des Bretts und der Züge -&gt; Sprengung des Projekts </w:t>
-      </w:r>
-    </w:p>
-    <w:p>
-      <w:pPr>
-        <w:pStyle w:val="Listenabsatz"/>
-        <w:numPr>
-          <w:ilvl w:val="0"/>
-          <w:numId w:val="1"/>
-        </w:numPr>
-        <w:rPr>
-          <w:sz w:val="22"/>
-          <w:szCs w:val="22"/>
-        </w:rPr>
-      </w:pPr>
-      <w:r>
-        <w:rPr>
-          <w:sz w:val="22"/>
-          <w:szCs w:val="22"/>
-        </w:rPr>
-        <w:t xml:space="preserve">Außerdem Defizite im Raumkontext -&gt; die Installation fügte sich nicht nahtlos in die Umgebung des Raums und Setting widersprach Leitfaden einer intuitiven Raumerfahrung </w:t>
-      </w:r>
-    </w:p>
-    <w:p>
-      <w:pPr>
-        <w:pStyle w:val="Listenabsatz"/>
-        <w:numPr>
-          <w:ilvl w:val="0"/>
-          <w:numId w:val="1"/>
-        </w:numPr>
-        <w:rPr>
-          <w:sz w:val="22"/>
-          <w:szCs w:val="22"/>
-        </w:rPr>
-      </w:pPr>
-      <w:r>
-        <w:rPr>
-          <w:sz w:val="22"/>
-          <w:szCs w:val="22"/>
-        </w:rPr>
-        <w:t xml:space="preserve">Interaktion wäre erzwungen gewesen, da sich Teilnehmer aktiv ans Schachbrett setzen und spielen müssen </w:t>
-      </w:r>
-    </w:p>
-    <w:p>
-      <w:pPr>
-        <w:pStyle w:val="Listenabsatz"/>
-        <w:numPr>
-          <w:ilvl w:val="0"/>
-          <w:numId w:val="1"/>
-        </w:numPr>
-        <w:rPr>
-          <w:sz w:val="22"/>
-          <w:szCs w:val="22"/>
-        </w:rPr>
-      </w:pPr>
-      <w:r>
-        <w:rPr>
-          <w:sz w:val="22"/>
-          <w:szCs w:val="22"/>
-        </w:rPr>
-        <w:t xml:space="preserve">Diese Erkenntnisse führten zu bewusster Entscheidung zugunsten einer besseren impliziten Interaktion, welche sich auf das wesentliche konzentriert -&gt;unmittelbare Auseinandersetzung mit virtuellem Selbst </w:t>
-      </w:r>
-    </w:p>
-    <w:p>
-      <w:pPr>
-        <w:pStyle w:val="Listenabsatz"/>
-        <w:numPr>
-          <w:ilvl w:val="0"/>
-          <w:numId w:val="1"/>
-        </w:numPr>
-        <w:rPr>
-          <w:sz w:val="22"/>
-          <w:szCs w:val="22"/>
-        </w:rPr>
-      </w:pPr>
-      <w:r>
-        <w:rPr>
-          <w:sz w:val="22"/>
-          <w:szCs w:val="22"/>
-        </w:rPr>
-        <w:t xml:space="preserve">-&gt; Fokus erstmal vollständig auf Erfassung und Projektion der menschlichen Schatten mittels Kinect Kamera </w:t>
-      </w:r>
-    </w:p>
-    <w:p>
-      <w:pPr>
-        <w:rPr>
-          <w:sz w:val="22"/>
-          <w:szCs w:val="22"/>
-        </w:rPr>
-      </w:pPr>
-    </w:p>
-    <w:p>
-      <w:pPr>
-        <w:rPr>
-          <w:sz w:val="22"/>
-          <w:szCs w:val="22"/>
-        </w:rPr>
-      </w:pPr>
-      <w:r>
-        <w:rPr>
-          <w:sz w:val="22"/>
-          <w:szCs w:val="22"/>
-        </w:rPr>
-        <w:t xml:space="preserve">3. Konzept </w:t>
-      </w:r>
-    </w:p>
-    <w:p>
-      <w:pPr>
-        <w:pStyle w:val="Listenabsatz"/>
-        <w:numPr>
-          <w:ilvl w:val="0"/>
-          <w:numId w:val="2"/>
-        </w:numPr>
-        <w:rPr>
-          <w:sz w:val="22"/>
-          <w:szCs w:val="22"/>
-        </w:rPr>
-      </w:pPr>
-      <w:r>
-        <w:rPr>
-          <w:sz w:val="22"/>
-          <w:szCs w:val="22"/>
-        </w:rPr>
-        <w:t xml:space="preserve">Nach Verabschiedung der Schachbrett Idee -&gt; Aufmerksamkeit auf impliziter Interaktion, </w:t>
-      </w:r>
-      <w:r>
-        <w:rPr>
-          <w:sz w:val="22"/>
-          <w:szCs w:val="22"/>
-        </w:rPr>
-        <w:t xml:space="preserve">bei der das reine Betreten des Raums ausreicht, um Teil davon zu sein </w:t>
-      </w:r>
-    </w:p>
-    <w:p>
-      <w:pPr>
-        <w:pStyle w:val="Listenabsatz"/>
-        <w:numPr>
-          <w:ilvl w:val="0"/>
-          <w:numId w:val="2"/>
-        </w:numPr>
-        <w:rPr>
-          <w:sz w:val="22"/>
-          <w:szCs w:val="22"/>
-        </w:rPr>
-      </w:pPr>
-      <w:r>
-        <w:rPr>
-          <w:sz w:val="22"/>
-          <w:szCs w:val="22"/>
-        </w:rPr>
-        <w:t xml:space="preserve">Teilnehmer sollen idealerweise im ersten Moment nicht merken, dass sie Schnittstelle bedienen </w:t>
-      </w:r>
-    </w:p>
-    <w:p>
-      <w:pPr>
-        <w:pStyle w:val="Listenabsatz"/>
-        <w:numPr>
-          <w:ilvl w:val="0"/>
-          <w:numId w:val="2"/>
-        </w:numPr>
-        <w:rPr>
-          <w:sz w:val="22"/>
-          <w:szCs w:val="22"/>
-        </w:rPr>
-      </w:pPr>
-      <w:r>
-        <w:rPr>
-          <w:sz w:val="22"/>
-          <w:szCs w:val="22"/>
-        </w:rPr>
-        <w:t xml:space="preserve">Es soll keine klassischen Eingabegeräte oder Tasten geben </w:t>
-      </w:r>
-    </w:p>
-    <w:p>
-      <w:pPr>
-        <w:pStyle w:val="Listenabsatz"/>
-        <w:numPr>
-          <w:ilvl w:val="0"/>
-          <w:numId w:val="2"/>
-        </w:numPr>
-        <w:rPr>
-          <w:sz w:val="22"/>
-          <w:szCs w:val="22"/>
-        </w:rPr>
-      </w:pPr>
-      <w:r>
-        <w:rPr>
-          <w:sz w:val="22"/>
-          <w:szCs w:val="22"/>
-        </w:rPr>
-        <w:t xml:space="preserve">Bloße Anwesenheit und natürliche Bewegungen dienen als direkter Input </w:t>
-      </w:r>
-    </w:p>
-    <w:p>
-      <w:pPr>
-        <w:pStyle w:val="Listenabsatz"/>
-        <w:numPr>
-          <w:ilvl w:val="0"/>
-          <w:numId w:val="2"/>
-        </w:numPr>
-        <w:rPr>
-          <w:sz w:val="22"/>
-          <w:szCs w:val="22"/>
-        </w:rPr>
-      </w:pPr>
-      <w:r>
-        <w:rPr>
-          <w:sz w:val="22"/>
-          <w:szCs w:val="22"/>
-        </w:rPr>
-        <w:t xml:space="preserve">Um Leitthema „virtuelles Selbst“ künstlerisch spannend umzusetzen </w:t>
-      </w:r>
-      <w:r>
-        <w:rPr>
-          <w:sz w:val="22"/>
-          <w:szCs w:val="22"/>
-        </w:rPr>
-        <w:t xml:space="preserve">-&gt; bewusste </w:t>
+    </w:p>
+    <w:p>
+      <w:pPr>
+        <w:rPr>
+          <w:sz w:val="22"/>
+          <w:szCs w:val="22"/>
+        </w:rPr>
+      </w:pPr>
+      <w:r>
+        <w:rPr>
+          <w:sz w:val="22"/>
+          <w:szCs w:val="22"/>
+        </w:rPr>
+        <w:t xml:space="preserve">4.1 Python Backend </w:t>
+      </w:r>
+    </w:p>
+    <w:p>
+      <w:pPr>
+        <w:pStyle w:val="Listenabsatz"/>
+        <w:numPr>
+          <w:ilvl w:val="0"/>
+          <w:numId w:val="5"/>
+        </w:numPr>
+        <w:rPr>
+          <w:sz w:val="22"/>
+          <w:szCs w:val="22"/>
+        </w:rPr>
+      </w:pPr>
+      <w:r>
+        <w:rPr>
+          <w:sz w:val="22"/>
+          <w:szCs w:val="22"/>
+        </w:rPr>
+        <w:t xml:space="preserve">Als zentrale Sensorik Azure Kinect, die am Raumeingang auf Stativ positioniert ist </w:t>
+      </w:r>
+    </w:p>
+    <w:p>
+      <w:pPr>
+        <w:pStyle w:val="Listenabsatz"/>
+        <w:numPr>
+          <w:ilvl w:val="0"/>
+          <w:numId w:val="5"/>
+        </w:numPr>
+        <w:rPr>
+          <w:sz w:val="22"/>
+          <w:szCs w:val="22"/>
+        </w:rPr>
+      </w:pPr>
+      <w:r>
+        <w:rPr>
+          <w:sz w:val="22"/>
+          <w:szCs w:val="22"/>
+        </w:rPr>
+        <w:t>Python Skript greift auf Tiefendaten zu</w:t>
+      </w:r>
+    </w:p>
+    <w:p>
+      <w:pPr>
+        <w:pStyle w:val="Listenabsatz"/>
+        <w:numPr>
+          <w:ilvl w:val="0"/>
+          <w:numId w:val="5"/>
+        </w:numPr>
+        <w:rPr>
+          <w:sz w:val="22"/>
+          <w:szCs w:val="22"/>
+        </w:rPr>
+      </w:pPr>
+      <w:r>
+        <w:rPr>
+          <w:sz w:val="22"/>
+          <w:szCs w:val="22"/>
+        </w:rPr>
+        <w:t xml:space="preserve">Definieren </w:t>
       </w:r>
       <w:proofErr w:type="spellStart"/>
       <w:r>
@@ -585,7 +1320,7 @@
           <w:sz w:val="22"/>
           <w:szCs w:val="22"/>
         </w:rPr>
-        <w:t>asynchrome</w:t>
+        <w:t>Bounding</w:t>
       </w:r>
       <w:proofErr w:type="spellEnd"/>
       <w:r>
@@ -593,91 +1328,7 @@
           <w:sz w:val="22"/>
           <w:szCs w:val="22"/>
         </w:rPr>
-        <w:t xml:space="preserve"> Anordnung von Aufnahme- und Ausgabeort  </w:t>
-      </w:r>
-    </w:p>
-    <w:p>
-      <w:pPr>
-        <w:pStyle w:val="Listenabsatz"/>
-        <w:numPr>
-          <w:ilvl w:val="0"/>
-          <w:numId w:val="2"/>
-        </w:numPr>
-        <w:rPr>
-          <w:sz w:val="22"/>
-          <w:szCs w:val="22"/>
-        </w:rPr>
-      </w:pPr>
-      <w:r>
-        <w:rPr>
-          <w:sz w:val="22"/>
-          <w:szCs w:val="22"/>
-        </w:rPr>
-        <w:t>Kamera nimmt Person am Eingang auf, während die Projektion auf der entgegengesetzten Seite stattfindet</w:t>
-      </w:r>
-      <w:r>
-        <w:rPr>
-          <w:sz w:val="22"/>
-          <w:szCs w:val="22"/>
-        </w:rPr>
-        <w:t xml:space="preserve"> -&gt; </w:t>
-      </w:r>
-      <w:r>
-        <w:rPr>
-          <w:sz w:val="22"/>
-          <w:szCs w:val="22"/>
-        </w:rPr>
-        <w:t>Durch Trennung entsteht Entfremdungseffekt</w:t>
-      </w:r>
-    </w:p>
-    <w:p>
-      <w:pPr>
-        <w:pStyle w:val="Listenabsatz"/>
-        <w:numPr>
-          <w:ilvl w:val="0"/>
-          <w:numId w:val="2"/>
-        </w:numPr>
-        <w:rPr>
-          <w:sz w:val="22"/>
-          <w:szCs w:val="22"/>
-        </w:rPr>
-      </w:pPr>
-      <w:proofErr w:type="gramStart"/>
-      <w:r>
-        <w:rPr>
-          <w:sz w:val="22"/>
-          <w:szCs w:val="22"/>
-        </w:rPr>
-        <w:t>Bei visuellen Darstellung</w:t>
-      </w:r>
-      <w:proofErr w:type="gramEnd"/>
-      <w:r>
-        <w:rPr>
-          <w:sz w:val="22"/>
-          <w:szCs w:val="22"/>
-        </w:rPr>
-        <w:t xml:space="preserve"> der Schatten haben wir wichtigen iterativen Prozess durchlaufen </w:t>
-      </w:r>
-    </w:p>
-    <w:p>
-      <w:pPr>
-        <w:pStyle w:val="Listenabsatz"/>
-        <w:numPr>
-          <w:ilvl w:val="0"/>
-          <w:numId w:val="2"/>
-        </w:numPr>
-        <w:rPr>
-          <w:sz w:val="22"/>
-          <w:szCs w:val="22"/>
-        </w:rPr>
-      </w:pPr>
-      <w:r>
-        <w:rPr>
-          <w:sz w:val="22"/>
-          <w:szCs w:val="22"/>
-        </w:rPr>
-        <w:lastRenderedPageBreak/>
-        <w:t xml:space="preserve">-&gt; Unser erster Ansatz: einzelne Frames der erfassten Person speichern, </w:t>
+        <w:t xml:space="preserve"> Box für die </w:t>
       </w:r>
       <w:proofErr w:type="spellStart"/>
       <w:r>
@@ -685,7 +1336,7 @@
           <w:sz w:val="22"/>
           <w:szCs w:val="22"/>
         </w:rPr>
-        <w:t>soabald</w:t>
+        <w:t>Teife</w:t>
       </w:r>
       <w:proofErr w:type="spellEnd"/>
       <w:r>
@@ -693,474 +1344,7 @@
           <w:sz w:val="22"/>
           <w:szCs w:val="22"/>
         </w:rPr>
-        <w:t xml:space="preserve"> jmd. Im Sichtfeld der Kamera ist </w:t>
-      </w:r>
-    </w:p>
-    <w:p>
-      <w:pPr>
-        <w:pStyle w:val="Listenabsatz"/>
-        <w:numPr>
-          <w:ilvl w:val="0"/>
-          <w:numId w:val="2"/>
-        </w:numPr>
-        <w:rPr>
-          <w:sz w:val="22"/>
-          <w:szCs w:val="22"/>
-        </w:rPr>
-      </w:pPr>
-      <w:r>
-        <w:rPr>
-          <w:sz w:val="22"/>
-          <w:szCs w:val="22"/>
-        </w:rPr>
-        <w:t xml:space="preserve">Diese Frames sollten dann zufällig auf der Projektionsfläche erscheinen und wieder verschwinden </w:t>
-      </w:r>
-    </w:p>
-    <w:p>
-      <w:pPr>
-        <w:pStyle w:val="Listenabsatz"/>
-        <w:numPr>
-          <w:ilvl w:val="0"/>
-          <w:numId w:val="2"/>
-        </w:numPr>
-        <w:rPr>
-          <w:sz w:val="22"/>
-          <w:szCs w:val="22"/>
-        </w:rPr>
-      </w:pPr>
-      <w:r>
-        <w:rPr>
-          <w:sz w:val="22"/>
-          <w:szCs w:val="22"/>
-        </w:rPr>
-        <w:t xml:space="preserve">Grundidee dahinter war es der Installation ein Gedächtnis zu geben </w:t>
-      </w:r>
-    </w:p>
-    <w:p>
-      <w:pPr>
-        <w:pStyle w:val="Listenabsatz"/>
-        <w:numPr>
-          <w:ilvl w:val="0"/>
-          <w:numId w:val="2"/>
-        </w:numPr>
-        <w:rPr>
-          <w:sz w:val="22"/>
-          <w:szCs w:val="22"/>
-        </w:rPr>
-      </w:pPr>
-      <w:r>
-        <w:rPr>
-          <w:sz w:val="22"/>
-          <w:szCs w:val="22"/>
-        </w:rPr>
-        <w:t>-&gt; wer interagiert, hinterlässt eine Spur und wird zum Teil des performativen Raums</w:t>
-      </w:r>
-    </w:p>
-    <w:p>
-      <w:pPr>
-        <w:pStyle w:val="Listenabsatz"/>
-        <w:numPr>
-          <w:ilvl w:val="0"/>
-          <w:numId w:val="2"/>
-        </w:numPr>
-        <w:rPr>
-          <w:sz w:val="22"/>
-          <w:szCs w:val="22"/>
-        </w:rPr>
-      </w:pPr>
-      <w:r>
-        <w:rPr>
-          <w:sz w:val="22"/>
-          <w:szCs w:val="22"/>
-        </w:rPr>
-        <w:t xml:space="preserve">Technisch hat der Ansatz funktioniert, aber wir waren mit visueller Wirkung unzufrieden </w:t>
-      </w:r>
-    </w:p>
-    <w:p>
-      <w:pPr>
-        <w:pStyle w:val="Listenabsatz"/>
-        <w:numPr>
-          <w:ilvl w:val="0"/>
-          <w:numId w:val="2"/>
-        </w:numPr>
-        <w:rPr>
-          <w:sz w:val="22"/>
-          <w:szCs w:val="22"/>
-        </w:rPr>
-      </w:pPr>
-      <w:r>
-        <w:rPr>
-          <w:sz w:val="22"/>
-          <w:szCs w:val="22"/>
-        </w:rPr>
-        <w:t xml:space="preserve">Einzelne Frames haben oft unvorteilhafte Momente gespeichert, wirkten eingefroren und passte ästhetisch nicht gut ins Bild </w:t>
-      </w:r>
-    </w:p>
-    <w:p>
-      <w:pPr>
-        <w:pStyle w:val="Listenabsatz"/>
-        <w:numPr>
-          <w:ilvl w:val="0"/>
-          <w:numId w:val="2"/>
-        </w:numPr>
-        <w:rPr>
-          <w:sz w:val="22"/>
-          <w:szCs w:val="22"/>
-        </w:rPr>
-      </w:pPr>
-      <w:r>
-        <w:rPr>
-          <w:sz w:val="22"/>
-          <w:szCs w:val="22"/>
-        </w:rPr>
-        <w:t xml:space="preserve">Auch Interaktion hat nicht profitiert, sondern fühlte sich starr an </w:t>
-      </w:r>
-    </w:p>
-    <w:p>
-      <w:pPr>
-        <w:pStyle w:val="Listenabsatz"/>
-        <w:numPr>
-          <w:ilvl w:val="0"/>
-          <w:numId w:val="2"/>
-        </w:numPr>
-        <w:rPr>
-          <w:sz w:val="22"/>
-          <w:szCs w:val="22"/>
-        </w:rPr>
-      </w:pPr>
-      <w:r>
-        <w:rPr>
-          <w:sz w:val="22"/>
-          <w:szCs w:val="22"/>
-        </w:rPr>
-        <w:t xml:space="preserve">Weiteres Problem: man konnte sich in einem einzelnen Frame oft schwer wiedererkennen, wodurch Bezug zum virtuellen Selbst verloren ging </w:t>
-      </w:r>
-    </w:p>
-    <w:p>
-      <w:pPr>
-        <w:pStyle w:val="Listenabsatz"/>
-        <w:numPr>
-          <w:ilvl w:val="0"/>
-          <w:numId w:val="2"/>
-        </w:numPr>
-        <w:rPr>
-          <w:sz w:val="22"/>
-          <w:szCs w:val="22"/>
-        </w:rPr>
-      </w:pPr>
-      <w:r>
-        <w:rPr>
-          <w:sz w:val="22"/>
-          <w:szCs w:val="22"/>
-        </w:rPr>
-        <w:t xml:space="preserve">Durchbruch dann mit Idee der Erweiterung von Frames auf </w:t>
-      </w:r>
-      <w:r>
-        <w:rPr>
-          <w:sz w:val="22"/>
-          <w:szCs w:val="22"/>
-        </w:rPr>
-        <w:t xml:space="preserve">ganze Bewegungssequenzen </w:t>
-      </w:r>
-    </w:p>
-    <w:p>
-      <w:pPr>
-        <w:pStyle w:val="Listenabsatz"/>
-        <w:numPr>
-          <w:ilvl w:val="0"/>
-          <w:numId w:val="2"/>
-        </w:numPr>
-        <w:rPr>
-          <w:sz w:val="22"/>
-          <w:szCs w:val="22"/>
-        </w:rPr>
-      </w:pPr>
-      <w:r>
-        <w:rPr>
-          <w:sz w:val="22"/>
-          <w:szCs w:val="22"/>
-        </w:rPr>
-        <w:t xml:space="preserve">Wenn ein Teilnehmer nun winkt, springt oder einfach vorbeigeht, wird dieser komplette Ablauf gesichert, wodurch sich Teilnehmer durch die Dynamik der Bewegung besser wiedererkennen </w:t>
-      </w:r>
-    </w:p>
-    <w:p>
-      <w:pPr>
-        <w:pStyle w:val="Listenabsatz"/>
-        <w:numPr>
-          <w:ilvl w:val="0"/>
-          <w:numId w:val="2"/>
-        </w:numPr>
-        <w:rPr>
-          <w:sz w:val="22"/>
-          <w:szCs w:val="22"/>
-        </w:rPr>
-      </w:pPr>
-      <w:r>
-        <w:rPr>
-          <w:sz w:val="22"/>
-          <w:szCs w:val="22"/>
-        </w:rPr>
-        <w:t>Das gespeicherte Winken taucht später, als eigenständiger „Ghost-Schatten“</w:t>
-      </w:r>
-      <w:r>
-        <w:rPr>
-          <w:sz w:val="22"/>
-          <w:szCs w:val="22"/>
-        </w:rPr>
-        <w:t xml:space="preserve"> </w:t>
-      </w:r>
-      <w:r>
-        <w:rPr>
-          <w:sz w:val="22"/>
-          <w:szCs w:val="22"/>
-        </w:rPr>
-        <w:t>wieder an der Wand auf -&gt; Prinzip des räumlichen Gedächtnisses bleibt erhalten, wird aber deutlich intensiver</w:t>
-      </w:r>
-    </w:p>
-    <w:p>
-      <w:pPr>
-        <w:pStyle w:val="Listenabsatz"/>
-        <w:numPr>
-          <w:ilvl w:val="0"/>
-          <w:numId w:val="2"/>
-        </w:numPr>
-        <w:rPr>
-          <w:sz w:val="22"/>
-          <w:szCs w:val="22"/>
-        </w:rPr>
-      </w:pPr>
-      <w:r>
-        <w:rPr>
-          <w:sz w:val="22"/>
-          <w:szCs w:val="22"/>
-        </w:rPr>
-        <w:t xml:space="preserve"> Um Gedächtnis visuell weiter zu verstärken und die Sequenzen besser voneinander abzugrenzen, besitzt jede wiedergegebene Schattensequenz eine eigene Farbe </w:t>
-      </w:r>
-    </w:p>
-    <w:p>
-      <w:pPr>
-        <w:pStyle w:val="Listenabsatz"/>
-        <w:numPr>
-          <w:ilvl w:val="0"/>
-          <w:numId w:val="2"/>
-        </w:numPr>
-        <w:rPr>
-          <w:sz w:val="22"/>
-          <w:szCs w:val="22"/>
-        </w:rPr>
-      </w:pPr>
-      <w:r>
-        <w:rPr>
-          <w:sz w:val="22"/>
-          <w:szCs w:val="22"/>
-        </w:rPr>
-        <w:t xml:space="preserve">Dadurch können Besucher Ihren Schatten noch deutlicher von anderen unterscheiden und das Gesamtbild wird lebendiger </w:t>
-      </w:r>
-    </w:p>
-    <w:p>
-      <w:pPr>
-        <w:pStyle w:val="Listenabsatz"/>
-        <w:numPr>
-          <w:ilvl w:val="0"/>
-          <w:numId w:val="2"/>
-        </w:numPr>
-        <w:rPr>
-          <w:sz w:val="22"/>
-          <w:szCs w:val="22"/>
-        </w:rPr>
-      </w:pPr>
-      <w:r>
-        <w:rPr>
-          <w:sz w:val="22"/>
-          <w:szCs w:val="22"/>
-        </w:rPr>
-        <w:t xml:space="preserve">Zusätzlich haben wir noch eine weitere Interaktion für die Schatten implementiert </w:t>
-      </w:r>
-    </w:p>
-    <w:p>
-      <w:pPr>
-        <w:pStyle w:val="Listenabsatz"/>
-        <w:numPr>
-          <w:ilvl w:val="0"/>
-          <w:numId w:val="2"/>
-        </w:numPr>
-        <w:rPr>
-          <w:sz w:val="22"/>
-          <w:szCs w:val="22"/>
-        </w:rPr>
-      </w:pPr>
-      <w:r>
-        <w:rPr>
-          <w:sz w:val="22"/>
-          <w:szCs w:val="22"/>
-        </w:rPr>
-        <w:t xml:space="preserve">Wenn eine Person zu lange im Visier der Kamera bleibt, löst sich der Schatten von selbst irgendwann auf </w:t>
-      </w:r>
-    </w:p>
-    <w:p>
-      <w:pPr>
-        <w:pStyle w:val="Listenabsatz"/>
-        <w:numPr>
-          <w:ilvl w:val="0"/>
-          <w:numId w:val="2"/>
-        </w:numPr>
-        <w:rPr>
-          <w:sz w:val="22"/>
-          <w:szCs w:val="22"/>
-        </w:rPr>
-      </w:pPr>
-      <w:r>
-        <w:rPr>
-          <w:sz w:val="22"/>
-          <w:szCs w:val="22"/>
-        </w:rPr>
-        <w:t>Diese Mechanik 2 Vorteile gleichzeitig: verhindert, dass das System durch Dauerpräsenz visuell blockiert wird (</w:t>
-      </w:r>
-      <w:proofErr w:type="gramStart"/>
-      <w:r>
-        <w:rPr>
-          <w:sz w:val="22"/>
-          <w:szCs w:val="22"/>
-        </w:rPr>
-        <w:t>beispielsweise</w:t>
-      </w:r>
-      <w:proofErr w:type="gramEnd"/>
-      <w:r>
-        <w:rPr>
-          <w:sz w:val="22"/>
-          <w:szCs w:val="22"/>
-        </w:rPr>
-        <w:t xml:space="preserve"> wenn sich jemand ununterbrochen vor die Kameralinse stellt) und es fügt sich perfekt in die Idee des performativen Raums ein, da es Teilnehmer subtil dazu motiviert, den Eingangsbereich zügig wieder freizugeben und sich weiter in den Raum hineinzubewegen </w:t>
-      </w:r>
-    </w:p>
-    <w:p>
-      <w:pPr>
-        <w:rPr>
-          <w:sz w:val="22"/>
-          <w:szCs w:val="22"/>
-        </w:rPr>
-      </w:pPr>
-    </w:p>
-    <w:p>
-      <w:pPr>
-        <w:rPr>
-          <w:sz w:val="22"/>
-          <w:szCs w:val="22"/>
-        </w:rPr>
-      </w:pPr>
-      <w:r>
-        <w:rPr>
-          <w:sz w:val="22"/>
-          <w:szCs w:val="22"/>
-        </w:rPr>
-        <w:t>4. Umsetzung (Technische Umsetzung: Hardware + Software)</w:t>
-      </w:r>
-    </w:p>
-    <w:p>
-      <w:pPr>
-        <w:pStyle w:val="Listenabsatz"/>
-        <w:numPr>
-          <w:ilvl w:val="0"/>
-          <w:numId w:val="4"/>
-        </w:numPr>
-        <w:rPr>
-          <w:sz w:val="22"/>
-          <w:szCs w:val="22"/>
-        </w:rPr>
-      </w:pPr>
-      <w:r>
-        <w:rPr>
-          <w:sz w:val="22"/>
-          <w:szCs w:val="22"/>
-        </w:rPr>
-        <w:t xml:space="preserve">Für technische Umsetzung haben wir uns für geteilte Architektur entschieden </w:t>
-      </w:r>
-    </w:p>
-    <w:p>
-      <w:pPr>
-        <w:pStyle w:val="Listenabsatz"/>
-        <w:numPr>
-          <w:ilvl w:val="0"/>
-          <w:numId w:val="4"/>
-        </w:numPr>
-        <w:rPr>
-          <w:sz w:val="22"/>
-          <w:szCs w:val="22"/>
-        </w:rPr>
-      </w:pPr>
-      <w:r>
-        <w:rPr>
-          <w:sz w:val="22"/>
-          <w:szCs w:val="22"/>
-        </w:rPr>
-        <w:t xml:space="preserve">Die hardwarenahe Sensorik und Datenaufbereitung läuft über Python-Backend, während visuelle Aufbereitung, das Speichermanagement und das Echtzeit Rendering in p5js Frontend im Webbrowser abgewickelt wird </w:t>
-      </w:r>
-    </w:p>
-    <w:p>
-      <w:pPr>
-        <w:pStyle w:val="Listenabsatz"/>
-        <w:numPr>
-          <w:ilvl w:val="0"/>
-          <w:numId w:val="4"/>
-        </w:numPr>
-        <w:rPr>
-          <w:sz w:val="22"/>
-          <w:szCs w:val="22"/>
-        </w:rPr>
-      </w:pPr>
-      <w:r>
-        <w:rPr>
-          <w:sz w:val="22"/>
-          <w:szCs w:val="22"/>
-        </w:rPr>
-        <w:t xml:space="preserve">Beide Systeme kommunizieren </w:t>
-      </w:r>
-      <w:proofErr w:type="spellStart"/>
-      <w:r>
-        <w:rPr>
-          <w:sz w:val="22"/>
-          <w:szCs w:val="22"/>
-        </w:rPr>
-        <w:t>asynchrom</w:t>
-      </w:r>
-      <w:proofErr w:type="spellEnd"/>
-      <w:r>
-        <w:rPr>
-          <w:sz w:val="22"/>
-          <w:szCs w:val="22"/>
-        </w:rPr>
-        <w:t xml:space="preserve"> über </w:t>
-      </w:r>
-      <w:proofErr w:type="spellStart"/>
-      <w:r>
-        <w:rPr>
-          <w:sz w:val="22"/>
-          <w:szCs w:val="22"/>
-        </w:rPr>
-        <w:t>Websockets</w:t>
-      </w:r>
-      <w:proofErr w:type="spellEnd"/>
-      <w:r>
-        <w:rPr>
-          <w:sz w:val="22"/>
-          <w:szCs w:val="22"/>
-        </w:rPr>
-        <w:t xml:space="preserve"> </w:t>
-      </w:r>
-    </w:p>
-    <w:p>
-      <w:pPr>
-        <w:rPr>
-          <w:sz w:val="22"/>
-          <w:szCs w:val="22"/>
-        </w:rPr>
-      </w:pPr>
-      <w:r>
-        <w:rPr>
-          <w:sz w:val="22"/>
-          <w:szCs w:val="22"/>
-        </w:rPr>
-        <w:t xml:space="preserve">4.1 Python Backend </w:t>
+        <w:t xml:space="preserve"> (MIN_DEPTH =1, MAX_DEPTH = 2075) um Umgebung auszublenden und nur Personen zu erfassen </w:t>
       </w:r>
     </w:p>
     <w:p>
@@ -1180,99 +1364,6 @@
           <w:sz w:val="22"/>
           <w:szCs w:val="22"/>
         </w:rPr>
-        <w:t xml:space="preserve">Als zentrale Sensorik Azure Kinect, die am Raumeingang auf Stativ positioniert ist </w:t>
-      </w:r>
-    </w:p>
-    <w:p>
-      <w:pPr>
-        <w:pStyle w:val="Listenabsatz"/>
-        <w:numPr>
-          <w:ilvl w:val="0"/>
-          <w:numId w:val="5"/>
-        </w:numPr>
-        <w:rPr>
-          <w:sz w:val="22"/>
-          <w:szCs w:val="22"/>
-        </w:rPr>
-      </w:pPr>
-      <w:r>
-        <w:rPr>
-          <w:sz w:val="22"/>
-          <w:szCs w:val="22"/>
-        </w:rPr>
-        <w:t>Python Skript greift auf Tiefendaten zu</w:t>
-      </w:r>
-    </w:p>
-    <w:p>
-      <w:pPr>
-        <w:pStyle w:val="Listenabsatz"/>
-        <w:numPr>
-          <w:ilvl w:val="0"/>
-          <w:numId w:val="5"/>
-        </w:numPr>
-        <w:rPr>
-          <w:sz w:val="22"/>
-          <w:szCs w:val="22"/>
-        </w:rPr>
-      </w:pPr>
-      <w:r>
-        <w:rPr>
-          <w:sz w:val="22"/>
-          <w:szCs w:val="22"/>
-        </w:rPr>
-        <w:t xml:space="preserve">Definieren </w:t>
-      </w:r>
-      <w:proofErr w:type="spellStart"/>
-      <w:r>
-        <w:rPr>
-          <w:sz w:val="22"/>
-          <w:szCs w:val="22"/>
-        </w:rPr>
-        <w:t>Bounding</w:t>
-      </w:r>
-      <w:proofErr w:type="spellEnd"/>
-      <w:r>
-        <w:rPr>
-          <w:sz w:val="22"/>
-          <w:szCs w:val="22"/>
-        </w:rPr>
-        <w:t xml:space="preserve"> Box für die </w:t>
-      </w:r>
-      <w:proofErr w:type="spellStart"/>
-      <w:r>
-        <w:rPr>
-          <w:sz w:val="22"/>
-          <w:szCs w:val="22"/>
-        </w:rPr>
-        <w:t>Teife</w:t>
-      </w:r>
-      <w:proofErr w:type="spellEnd"/>
-      <w:r>
-        <w:rPr>
-          <w:sz w:val="22"/>
-          <w:szCs w:val="22"/>
-        </w:rPr>
-        <w:t xml:space="preserve"> (MIN_DEPTH =1, MAX_DEPTH = 2075) um Umgebung auszublenden und nur Personen zu erfassen </w:t>
-      </w:r>
-    </w:p>
-    <w:p>
-      <w:pPr>
-        <w:pStyle w:val="Listenabsatz"/>
-        <w:numPr>
-          <w:ilvl w:val="0"/>
-          <w:numId w:val="5"/>
-        </w:numPr>
-        <w:rPr>
-          <w:sz w:val="22"/>
-          <w:szCs w:val="22"/>
-        </w:rPr>
-      </w:pPr>
-      <w:r>
-        <w:rPr>
-          <w:sz w:val="22"/>
-          <w:szCs w:val="22"/>
-        </w:rPr>
-        <w:lastRenderedPageBreak/>
         <w:t xml:space="preserve">Alles in diesem definierten Bereich wird als schwarze Silhouette auf weißem Untergrund dargestellt </w:t>
       </w:r>
     </w:p>
@@ -1955,6 +2046,7 @@
           <w:sz w:val="22"/>
           <w:szCs w:val="22"/>
         </w:rPr>
+        <w:lastRenderedPageBreak/>
         <w:t xml:space="preserve">Dadurch liegen </w:t>
       </w:r>
       <w:proofErr w:type="spellStart"/>
@@ -2178,26 +2270,354 @@
           <w:sz w:val="22"/>
           <w:szCs w:val="22"/>
         </w:rPr>
-        <w:lastRenderedPageBreak/>
         <w:t xml:space="preserve">5. Fazit und Ausblick </w:t>
       </w:r>
     </w:p>
     <w:p>
       <w:pPr>
-        <w:ind w:left="360"/>
-        <w:rPr>
-          <w:sz w:val="22"/>
-          <w:szCs w:val="22"/>
-        </w:rPr>
-      </w:pPr>
-    </w:p>
-    <w:p>
-      <w:pPr>
-        <w:rPr>
-          <w:sz w:val="22"/>
-          <w:szCs w:val="22"/>
-        </w:rPr>
-      </w:pPr>
+        <w:pStyle w:val="Listenabsatz"/>
+        <w:numPr>
+          <w:ilvl w:val="0"/>
+          <w:numId w:val="7"/>
+        </w:numPr>
+        <w:rPr>
+          <w:sz w:val="22"/>
+          <w:szCs w:val="22"/>
+        </w:rPr>
+      </w:pPr>
+      <w:r>
+        <w:rPr>
+          <w:sz w:val="22"/>
+          <w:szCs w:val="22"/>
+        </w:rPr>
+        <w:t xml:space="preserve">Rückblickend auf gesamten Entwicklungsprozess war eine der größten Hürden zweifellos das Ressourcen Management </w:t>
+      </w:r>
+    </w:p>
+    <w:p>
+      <w:pPr>
+        <w:pStyle w:val="Listenabsatz"/>
+        <w:numPr>
+          <w:ilvl w:val="0"/>
+          <w:numId w:val="7"/>
+        </w:numPr>
+        <w:rPr>
+          <w:sz w:val="22"/>
+          <w:szCs w:val="22"/>
+        </w:rPr>
+      </w:pPr>
+      <w:r>
+        <w:rPr>
+          <w:sz w:val="22"/>
+          <w:szCs w:val="22"/>
+        </w:rPr>
+        <w:t xml:space="preserve">Insbesondere die Aufrechterhaltung einer stabilen Performance im Webbrowser </w:t>
+      </w:r>
+    </w:p>
+    <w:p>
+      <w:pPr>
+        <w:pStyle w:val="Listenabsatz"/>
+        <w:numPr>
+          <w:ilvl w:val="0"/>
+          <w:numId w:val="7"/>
+        </w:numPr>
+        <w:rPr>
+          <w:sz w:val="22"/>
+          <w:szCs w:val="22"/>
+        </w:rPr>
+      </w:pPr>
+      <w:r>
+        <w:rPr>
+          <w:sz w:val="22"/>
+          <w:szCs w:val="22"/>
+        </w:rPr>
+        <w:t xml:space="preserve">Ununterbrochene Bitströme drohten RAM bei Zwischenspeicherung schnell zu überfordern </w:t>
+      </w:r>
+    </w:p>
+    <w:p>
+      <w:pPr>
+        <w:pStyle w:val="Listenabsatz"/>
+        <w:numPr>
+          <w:ilvl w:val="0"/>
+          <w:numId w:val="7"/>
+        </w:numPr>
+        <w:rPr>
+          <w:sz w:val="22"/>
+          <w:szCs w:val="22"/>
+        </w:rPr>
+      </w:pPr>
+      <w:r>
+        <w:rPr>
+          <w:sz w:val="22"/>
+          <w:szCs w:val="22"/>
+        </w:rPr>
+        <w:t xml:space="preserve">Auch die rohen Bilddaten der Sensoren entsprachen anfangs nicht unseren ästhetischen Vorstellungen </w:t>
+      </w:r>
+    </w:p>
+    <w:p>
+      <w:pPr>
+        <w:pStyle w:val="Listenabsatz"/>
+        <w:numPr>
+          <w:ilvl w:val="0"/>
+          <w:numId w:val="7"/>
+        </w:numPr>
+        <w:rPr>
+          <w:sz w:val="22"/>
+          <w:szCs w:val="22"/>
+        </w:rPr>
+      </w:pPr>
+      <w:r>
+        <w:rPr>
+          <w:sz w:val="22"/>
+          <w:szCs w:val="22"/>
+        </w:rPr>
+        <w:t xml:space="preserve">-&gt; erst durch die Fischaugen-Entzerrung in p5js konnten verwertbare menschliche Proportionen dargestellt werden </w:t>
+      </w:r>
+    </w:p>
+    <w:p>
+      <w:pPr>
+        <w:pStyle w:val="Listenabsatz"/>
+        <w:numPr>
+          <w:ilvl w:val="0"/>
+          <w:numId w:val="7"/>
+        </w:numPr>
+        <w:rPr>
+          <w:sz w:val="22"/>
+          <w:szCs w:val="22"/>
+        </w:rPr>
+      </w:pPr>
+      <w:r>
+        <w:rPr>
+          <w:sz w:val="22"/>
+          <w:szCs w:val="22"/>
+        </w:rPr>
+        <w:t xml:space="preserve"> Größte Erfolg des Projekts war der konzeptionelle Sprung von einzelnen Frames hinzu de</w:t>
+      </w:r>
+      <w:r>
+        <w:rPr>
+          <w:sz w:val="22"/>
+          <w:szCs w:val="22"/>
+        </w:rPr>
+        <w:t xml:space="preserve">r Speicherung von Framesequenzen </w:t>
+      </w:r>
+    </w:p>
+    <w:p>
+      <w:pPr>
+        <w:pStyle w:val="Listenabsatz"/>
+        <w:numPr>
+          <w:ilvl w:val="0"/>
+          <w:numId w:val="7"/>
+        </w:numPr>
+        <w:rPr>
+          <w:sz w:val="22"/>
+          <w:szCs w:val="22"/>
+        </w:rPr>
+      </w:pPr>
+      <w:r>
+        <w:rPr>
+          <w:sz w:val="22"/>
+          <w:szCs w:val="22"/>
+        </w:rPr>
+        <w:t xml:space="preserve">-&gt; Anpassung viele UX-Probleme prompt gelöst </w:t>
+      </w:r>
+    </w:p>
+    <w:p>
+      <w:pPr>
+        <w:pStyle w:val="Listenabsatz"/>
+        <w:numPr>
+          <w:ilvl w:val="0"/>
+          <w:numId w:val="7"/>
+        </w:numPr>
+        <w:rPr>
+          <w:sz w:val="22"/>
+          <w:szCs w:val="22"/>
+        </w:rPr>
+      </w:pPr>
+      <w:r>
+        <w:rPr>
+          <w:sz w:val="22"/>
+          <w:szCs w:val="22"/>
+        </w:rPr>
+        <w:t xml:space="preserve">Installation verlor Starrheit und fühlte sich erstmals wie ein echtes Gedächtnis an, indem Nutzer sich durch ihre Bewegungen (wie Winken) mit ihrem virtuellen selbst identifizieren konnten </w:t>
+      </w:r>
+    </w:p>
+    <w:p>
+      <w:pPr>
+        <w:pStyle w:val="Listenabsatz"/>
+        <w:numPr>
+          <w:ilvl w:val="0"/>
+          <w:numId w:val="7"/>
+        </w:numPr>
+        <w:rPr>
+          <w:sz w:val="22"/>
+          <w:szCs w:val="22"/>
+        </w:rPr>
+      </w:pPr>
+      <w:r>
+        <w:rPr>
+          <w:sz w:val="22"/>
+          <w:szCs w:val="22"/>
+        </w:rPr>
+        <w:t xml:space="preserve">Würden wir das Projekt fortführen, läge Fokus auf weiteren Interaktionsmöglichkeiten </w:t>
+      </w:r>
+    </w:p>
+    <w:p>
+      <w:pPr>
+        <w:pStyle w:val="Listenabsatz"/>
+        <w:numPr>
+          <w:ilvl w:val="0"/>
+          <w:numId w:val="7"/>
+        </w:numPr>
+        <w:rPr>
+          <w:sz w:val="22"/>
+          <w:szCs w:val="22"/>
+        </w:rPr>
+      </w:pPr>
+      <w:r>
+        <w:rPr>
+          <w:sz w:val="22"/>
+          <w:szCs w:val="22"/>
+        </w:rPr>
+        <w:t xml:space="preserve">Eine sinnvolle Idee wäre die Schattenlogik, um </w:t>
+      </w:r>
+      <w:proofErr w:type="spellStart"/>
+      <w:r>
+        <w:rPr>
+          <w:sz w:val="22"/>
+          <w:szCs w:val="22"/>
+        </w:rPr>
+        <w:t>Proxemics</w:t>
+      </w:r>
+      <w:proofErr w:type="spellEnd"/>
+      <w:r>
+        <w:rPr>
+          <w:sz w:val="22"/>
+          <w:szCs w:val="22"/>
+        </w:rPr>
+        <w:t xml:space="preserve"> und Interaktionen zwischen den Schatten zu erweitern </w:t>
+      </w:r>
+    </w:p>
+    <w:p>
+      <w:pPr>
+        <w:pStyle w:val="Listenabsatz"/>
+        <w:numPr>
+          <w:ilvl w:val="0"/>
+          <w:numId w:val="7"/>
+        </w:numPr>
+        <w:rPr>
+          <w:sz w:val="22"/>
+          <w:szCs w:val="22"/>
+        </w:rPr>
+      </w:pPr>
+      <w:r>
+        <w:rPr>
+          <w:sz w:val="22"/>
+          <w:szCs w:val="22"/>
+        </w:rPr>
+        <w:t xml:space="preserve">Geplant war, dass sich eine visuelle Verbindung zwischen den Schatten aufbaut, sobald diese sich auf der Projektionsfläche annähern und wieder schwächer wird, sobald sie sich voneinander entfernen </w:t>
+      </w:r>
+    </w:p>
+    <w:p>
+      <w:pPr>
+        <w:pStyle w:val="Listenabsatz"/>
+        <w:numPr>
+          <w:ilvl w:val="0"/>
+          <w:numId w:val="7"/>
+        </w:numPr>
+        <w:rPr>
+          <w:sz w:val="22"/>
+          <w:szCs w:val="22"/>
+        </w:rPr>
+      </w:pPr>
+      <w:r>
+        <w:rPr>
+          <w:sz w:val="22"/>
+          <w:szCs w:val="22"/>
+        </w:rPr>
+        <w:t xml:space="preserve">Für unsere spannendste Erweiterungsidee müsste die Installation um </w:t>
+      </w:r>
+      <w:r>
+        <w:rPr>
+          <w:sz w:val="22"/>
+          <w:szCs w:val="22"/>
+        </w:rPr>
+        <w:t xml:space="preserve">grundlegendes Gesichts- und Blickrichtungstracking erweitert werden. </w:t>
+      </w:r>
+    </w:p>
+    <w:p>
+      <w:pPr>
+        <w:pStyle w:val="Listenabsatz"/>
+        <w:numPr>
+          <w:ilvl w:val="0"/>
+          <w:numId w:val="7"/>
+        </w:numPr>
+        <w:rPr>
+          <w:sz w:val="22"/>
+          <w:szCs w:val="22"/>
+        </w:rPr>
+      </w:pPr>
+      <w:r>
+        <w:rPr>
+          <w:sz w:val="22"/>
+          <w:szCs w:val="22"/>
+        </w:rPr>
+        <w:t xml:space="preserve">Die Idee wäre, dass sich ein Schatten vollkommen normal verhält, solange der Nutzer in Richtung der Wand blickt </w:t>
+      </w:r>
+    </w:p>
+    <w:p>
+      <w:pPr>
+        <w:pStyle w:val="Listenabsatz"/>
+        <w:numPr>
+          <w:ilvl w:val="0"/>
+          <w:numId w:val="7"/>
+        </w:numPr>
+        <w:rPr>
+          <w:sz w:val="22"/>
+          <w:szCs w:val="22"/>
+        </w:rPr>
+      </w:pPr>
+      <w:r>
+        <w:rPr>
+          <w:sz w:val="22"/>
+          <w:szCs w:val="22"/>
+        </w:rPr>
+        <w:t xml:space="preserve">Sobald er der Projektion jedoch den Rücken zukehrt, bricht das virtuelle Selbst die Norm und wächst beispielsweise extrem </w:t>
+      </w:r>
+    </w:p>
+    <w:p>
+      <w:pPr>
+        <w:pStyle w:val="Listenabsatz"/>
+        <w:numPr>
+          <w:ilvl w:val="0"/>
+          <w:numId w:val="7"/>
+        </w:numPr>
+        <w:rPr>
+          <w:sz w:val="22"/>
+          <w:szCs w:val="22"/>
+        </w:rPr>
+      </w:pPr>
+      <w:r>
+        <w:rPr>
+          <w:sz w:val="22"/>
+          <w:szCs w:val="22"/>
+        </w:rPr>
+        <w:t xml:space="preserve">Dies würde das Thema des virtuellen </w:t>
+      </w:r>
+      <w:proofErr w:type="spellStart"/>
+      <w:r>
+        <w:rPr>
+          <w:sz w:val="22"/>
+          <w:szCs w:val="22"/>
+        </w:rPr>
+        <w:t>Selbsts</w:t>
+      </w:r>
+      <w:proofErr w:type="spellEnd"/>
+      <w:r>
+        <w:rPr>
+          <w:sz w:val="22"/>
+          <w:szCs w:val="22"/>
+        </w:rPr>
+        <w:t xml:space="preserve"> auf die nächste Ebene bringen </w:t>
+      </w:r>
     </w:p>
     <w:sectPr>
       <w:pgSz w:w="11906" w:h="16838"/>
@@ -2548,6 +2968,207 @@
     </w:lvl>
   </w:abstractNum>
   <w:abstractNum w:abstractNumId="3" w15:restartNumberingAfterBreak="0">
+    <w:nsid w:val="27AF31CA"/>
+    <w:multiLevelType w:val="hybridMultilevel"/>
+    <w:tmpl w:val="B6E87FB8"/>
+    <w:lvl w:ilvl="0" w:tplc="C73E344A">
+      <w:numFmt w:val="bullet"/>
+      <w:lvlText w:val="-"/>
+      <w:lvlJc w:val="left"/>
+      <w:pPr>
+        <w:ind w:left="720" w:hanging="360"/>
+      </w:pPr>
+      <w:rPr>
+        <w:rFonts w:ascii="Calibri" w:eastAsiaTheme="minorEastAsia" w:hAnsi="Calibri" w:cs="Calibri" w:hint="default"/>
+      </w:rPr>
+    </w:lvl>
+    <w:lvl w:ilvl="1" w:tplc="04070003" w:tentative="1">
+      <w:start w:val="1"/>
+      <w:numFmt w:val="bullet"/>
+      <w:lvlText w:val="o"/>
+      <w:lvlJc w:val="left"/>
+      <w:pPr>
+        <w:ind w:left="1440" w:hanging="360"/>
+      </w:pPr>
+      <w:rPr>
+        <w:rFonts w:ascii="Courier New" w:hAnsi="Courier New" w:cs="Courier New" w:hint="default"/>
+      </w:rPr>
+    </w:lvl>
+    <w:lvl w:ilvl="2" w:tplc="04070005" w:tentative="1">
+      <w:start w:val="1"/>
+      <w:numFmt w:val="bullet"/>
+      <w:lvlText w:val=""/>
+      <w:lvlJc w:val="left"/>
+      <w:pPr>
+        <w:ind w:left="2160" w:hanging="360"/>
+      </w:pPr>
+      <w:rPr>
+        <w:rFonts w:ascii="Wingdings" w:hAnsi="Wingdings" w:hint="default"/>
+      </w:rPr>
+    </w:lvl>
+    <w:lvl w:ilvl="3" w:tplc="04070001" w:tentative="1">
+      <w:start w:val="1"/>
+      <w:numFmt w:val="bullet"/>
+      <w:lvlText w:val=""/>
+      <w:lvlJc w:val="left"/>
+      <w:pPr>
+        <w:ind w:left="2880" w:hanging="360"/>
+      </w:pPr>
+      <w:rPr>
+        <w:rFonts w:ascii="Symbol" w:hAnsi="Symbol" w:hint="default"/>
+      </w:rPr>
+    </w:lvl>
+    <w:lvl w:ilvl="4" w:tplc="04070003" w:tentative="1">
+      <w:start w:val="1"/>
+      <w:numFmt w:val="bullet"/>
+      <w:lvlText w:val="o"/>
+      <w:lvlJc w:val="left"/>
+      <w:pPr>
+        <w:ind w:left="3600" w:hanging="360"/>
+      </w:pPr>
+      <w:rPr>
+        <w:rFonts w:ascii="Courier New" w:hAnsi="Courier New" w:cs="Courier New" w:hint="default"/>
+      </w:rPr>
+    </w:lvl>
+    <w:lvl w:ilvl="5" w:tplc="04070005" w:tentative="1">
+      <w:start w:val="1"/>
+      <w:numFmt w:val="bullet"/>
+      <w:lvlText w:val=""/>
+      <w:lvlJc w:val="left"/>
+      <w:pPr>
+        <w:ind w:left="4320" w:hanging="360"/>
+      </w:pPr>
+      <w:rPr>
+        <w:rFonts w:ascii="Wingdings" w:hAnsi="Wingdings" w:hint="default"/>
+      </w:rPr>
+    </w:lvl>
+    <w:lvl w:ilvl="6" w:tplc="04070001" w:tentative="1">
+      <w:start w:val="1"/>
+      <w:numFmt w:val="bullet"/>
+      <w:lvlText w:val=""/>
+      <w:lvlJc w:val="left"/>
+      <w:pPr>
+        <w:ind w:left="5040" w:hanging="360"/>
+      </w:pPr>
+      <w:rPr>
+        <w:rFonts w:ascii="Symbol" w:hAnsi="Symbol" w:hint="default"/>
+      </w:rPr>
+    </w:lvl>
+    <w:lvl w:ilvl="7" w:tplc="04070003" w:tentative="1">
+      <w:start w:val="1"/>
+      <w:numFmt w:val="bullet"/>
+      <w:lvlText w:val="o"/>
+      <w:lvlJc w:val="left"/>
+      <w:pPr>
+        <w:ind w:left="5760" w:hanging="360"/>
+      </w:pPr>
+      <w:rPr>
+        <w:rFonts w:ascii="Courier New" w:hAnsi="Courier New" w:cs="Courier New" w:hint="default"/>
+      </w:rPr>
+    </w:lvl>
+    <w:lvl w:ilvl="8" w:tplc="04070005" w:tentative="1">
+      <w:start w:val="1"/>
+      <w:numFmt w:val="bullet"/>
+      <w:lvlText w:val=""/>
+      <w:lvlJc w:val="left"/>
+      <w:pPr>
+        <w:ind w:left="6480" w:hanging="360"/>
+      </w:pPr>
+      <w:rPr>
+        <w:rFonts w:ascii="Wingdings" w:hAnsi="Wingdings" w:hint="default"/>
+      </w:rPr>
+    </w:lvl>
+  </w:abstractNum>
+  <w:abstractNum w:abstractNumId="4" w15:restartNumberingAfterBreak="0">
+    <w:nsid w:val="452E4711"/>
+    <w:multiLevelType w:val="hybridMultilevel"/>
+    <w:tmpl w:val="C4F6A86A"/>
+    <w:lvl w:ilvl="0" w:tplc="0407000F">
+      <w:start w:val="1"/>
+      <w:numFmt w:val="decimal"/>
+      <w:lvlText w:val="%1."/>
+      <w:lvlJc w:val="left"/>
+      <w:pPr>
+        <w:ind w:left="720" w:hanging="360"/>
+      </w:pPr>
+      <w:rPr>
+        <w:rFonts w:hint="default"/>
+      </w:rPr>
+    </w:lvl>
+    <w:lvl w:ilvl="1" w:tplc="04070019" w:tentative="1">
+      <w:start w:val="1"/>
+      <w:numFmt w:val="lowerLetter"/>
+      <w:lvlText w:val="%2."/>
+      <w:lvlJc w:val="left"/>
+      <w:pPr>
+        <w:ind w:left="1440" w:hanging="360"/>
+      </w:pPr>
+    </w:lvl>
+    <w:lvl w:ilvl="2" w:tplc="0407001B" w:tentative="1">
+      <w:start w:val="1"/>
+      <w:numFmt w:val="lowerRoman"/>
+      <w:lvlText w:val="%3."/>
+      <w:lvlJc w:val="right"/>
+      <w:pPr>
+        <w:ind w:left="2160" w:hanging="180"/>
+      </w:pPr>
+    </w:lvl>
+    <w:lvl w:ilvl="3" w:tplc="0407000F" w:tentative="1">
+      <w:start w:val="1"/>
+      <w:numFmt w:val="decimal"/>
+      <w:lvlText w:val="%4."/>
+      <w:lvlJc w:val="left"/>
+      <w:pPr>
+        <w:ind w:left="2880" w:hanging="360"/>
+      </w:pPr>
+    </w:lvl>
+    <w:lvl w:ilvl="4" w:tplc="04070019" w:tentative="1">
+      <w:start w:val="1"/>
+      <w:numFmt w:val="lowerLetter"/>
+      <w:lvlText w:val="%5."/>
+      <w:lvlJc w:val="left"/>
+      <w:pPr>
+        <w:ind w:left="3600" w:hanging="360"/>
+      </w:pPr>
+    </w:lvl>
+    <w:lvl w:ilvl="5" w:tplc="0407001B" w:tentative="1">
+      <w:start w:val="1"/>
+      <w:numFmt w:val="lowerRoman"/>
+      <w:lvlText w:val="%6."/>
+      <w:lvlJc w:val="right"/>
+      <w:pPr>
+        <w:ind w:left="4320" w:hanging="180"/>
+      </w:pPr>
+    </w:lvl>
+    <w:lvl w:ilvl="6" w:tplc="0407000F" w:tentative="1">
+      <w:start w:val="1"/>
+      <w:numFmt w:val="decimal"/>
+      <w:lvlText w:val="%7."/>
+      <w:lvlJc w:val="left"/>
+      <w:pPr>
+        <w:ind w:left="5040" w:hanging="360"/>
+      </w:pPr>
+    </w:lvl>
+    <w:lvl w:ilvl="7" w:tplc="04070019" w:tentative="1">
+      <w:start w:val="1"/>
+      <w:numFmt w:val="lowerLetter"/>
+      <w:lvlText w:val="%8."/>
+      <w:lvlJc w:val="left"/>
+      <w:pPr>
+        <w:ind w:left="5760" w:hanging="360"/>
+      </w:pPr>
+    </w:lvl>
+    <w:lvl w:ilvl="8" w:tplc="0407001B" w:tentative="1">
+      <w:start w:val="1"/>
+      <w:numFmt w:val="lowerRoman"/>
+      <w:lvlText w:val="%9."/>
+      <w:lvlJc w:val="right"/>
+      <w:pPr>
+        <w:ind w:left="6480" w:hanging="180"/>
+      </w:pPr>
+    </w:lvl>
+  </w:abstractNum>
+  <w:abstractNum w:abstractNumId="5" w15:restartNumberingAfterBreak="0">
     <w:nsid w:val="64927074"/>
     <w:multiLevelType w:val="hybridMultilevel"/>
     <w:tmpl w:val="5B3CA308"/>
@@ -2659,7 +3280,7 @@
       </w:rPr>
     </w:lvl>
   </w:abstractNum>
-  <w:abstractNum w:abstractNumId="4" w15:restartNumberingAfterBreak="0">
+  <w:abstractNum w:abstractNumId="6" w15:restartNumberingAfterBreak="0">
     <w:nsid w:val="6A871404"/>
     <w:multiLevelType w:val="hybridMultilevel"/>
     <w:tmpl w:val="3CFCE338"/>
@@ -2771,7 +3392,7 @@
       </w:rPr>
     </w:lvl>
   </w:abstractNum>
-  <w:abstractNum w:abstractNumId="5" w15:restartNumberingAfterBreak="0">
+  <w:abstractNum w:abstractNumId="7" w15:restartNumberingAfterBreak="0">
     <w:nsid w:val="7BB17EDB"/>
     <w:multiLevelType w:val="hybridMultilevel"/>
     <w:tmpl w:val="DA0488AE"/>
@@ -2884,22 +3505,28 @@
     </w:lvl>
   </w:abstractNum>
   <w:num w:numId="1" w16cid:durableId="1696924750">
-    <w:abstractNumId w:val="3"/>
+    <w:abstractNumId w:val="5"/>
   </w:num>
   <w:num w:numId="2" w16cid:durableId="810562462">
-    <w:abstractNumId w:val="5"/>
+    <w:abstractNumId w:val="7"/>
   </w:num>
   <w:num w:numId="3" w16cid:durableId="843740447">
     <w:abstractNumId w:val="1"/>
   </w:num>
   <w:num w:numId="4" w16cid:durableId="1491092893">
-    <w:abstractNumId w:val="4"/>
+    <w:abstractNumId w:val="6"/>
   </w:num>
   <w:num w:numId="5" w16cid:durableId="178660050">
     <w:abstractNumId w:val="0"/>
   </w:num>
   <w:num w:numId="6" w16cid:durableId="1084258125">
     <w:abstractNumId w:val="2"/>
+  </w:num>
+  <w:num w:numId="7" w16cid:durableId="1502740483">
+    <w:abstractNumId w:val="3"/>
+  </w:num>
+  <w:num w:numId="8" w16cid:durableId="2118283687">
+    <w:abstractNumId w:val="4"/>
   </w:num>
 </w:numbering>
 </file>

</xml_diff>

<commit_message>
Anpassung Frames auf Festplatte
</commit_message>
<xml_diff>
--- a/Dokumentation.docx
+++ b/Dokumentation.docx
@@ -2,6 +2,7 @@
 <file path=word/document.xml><?xml version="1.0" encoding="utf-8"?>
 <w:document xmlns:wpc="http://schemas.microsoft.com/office/word/2010/wordprocessingCanvas" xmlns:cx="http://schemas.microsoft.com/office/drawing/2014/chartex" xmlns:cx1="http://schemas.microsoft.com/office/drawing/2015/9/8/chartex" xmlns:cx2="http://schemas.microsoft.com/office/drawing/2015/10/21/chartex" xmlns:cx3="http://schemas.microsoft.com/office/drawing/2016/5/9/chartex" xmlns:cx4="http://schemas.microsoft.com/office/drawing/2016/5/10/chartex" xmlns:cx5="http://schemas.microsoft.com/office/drawing/2016/5/11/chartex" xmlns:cx6="http://schemas.microsoft.com/office/drawing/2016/5/12/chartex" xmlns:cx7="http://schemas.microsoft.com/office/drawing/2016/5/13/chartex" xmlns:cx8="http://schemas.microsoft.com/office/drawing/2016/5/14/chartex" xmlns:mc="http://schemas.openxmlformats.org/markup-compatibility/2006" xmlns:m="http://schemas.openxmlformats.org/officeDocument/2006/math" xmlns:aink="http://schemas.microsoft.com/office/drawing/2016/ink" xmlns:am3d="http://schemas.microsoft.com/office/drawing/2017/model3d" xmlns:oel="http://schemas.microsoft.com/office/2019/extlst" xmlns:r="http://schemas.openxmlformats.org/officeDocument/2006/relationships" xmlns:wp14="http://schemas.microsoft.com/office/word/2010/wordprocessingDrawing" xmlns:wp="http://schemas.openxmlformats.org/drawingml/2006/wordprocessingDrawing" xmlns:wpg="http://schemas.microsoft.com/office/word/2010/wordprocessingGroup" xmlns:wpi="http://schemas.microsoft.com/office/word/2010/wordprocessingInk" xmlns:wps="http://schemas.microsoft.com/office/word/2010/wordprocessingShape" xmlns:o="urn:schemas-microsoft-com:office:office" xmlns:v="urn:schemas-microsoft-com:vml" xmlns:w10="urn:schemas-microsoft-com:office:word" xmlns:w="http://schemas.openxmlformats.org/wordprocessingml/2006/main" xmlns:w14="http://schemas.microsoft.com/office/word/2010/wordml" xmlns:w15="http://schemas.microsoft.com/office/word/2012/wordml" xmlns:w16cei="http://schemas.microsoft.com/office/word/2026/wordml/cei" xmlns:w16cex="http://schemas.microsoft.com/office/word/2018/wordml/cex" xmlns:w16cid="http://schemas.microsoft.com/office/word/2016/wordml/cid" xmlns:w16="http://schemas.microsoft.com/office/word/2018/wordml" xmlns:w16sdtdh="http://schemas.microsoft.com/office/word/2020/wordml/sdtdatahash" xmlns:w16sdtfl="http://schemas.microsoft.com/office/word/2024/wordml/sdtformatlock" xmlns:w16se="http://schemas.microsoft.com/office/word/2015/wordml/symex" xmlns:w16du="http://schemas.microsoft.com/office/word/2023/wordml/word16du" xmlns:wne="http://schemas.microsoft.com/office/word/2006/wordml" mc:Ignorable="w14 w15 w16se w16cid w16 w16cex w16sdtdh w16sdtfl w16du wp14">
   <w:body>
+    <w:bookmarkStart w:id="0" w:name="OLE_LINK1" w:displacedByCustomXml="next"/>
     <w:sdt>
       <w:sdtPr>
         <w:rPr>
@@ -655,7 +656,23 @@
           <w:sz w:val="22"/>
           <w:szCs w:val="22"/>
         </w:rPr>
-        <w:t xml:space="preserve"> dann ihre Bewegungen in farblich kodierte Geisterschatten um und projiziert diese mithilfe eines </w:t>
+        <w:t xml:space="preserve"> dann ihre Bewegungen in farblich kodierte Geisterschatten um und projizier</w:t>
+      </w:r>
+      <w:r>
+        <w:rPr>
+          <w:rFonts w:ascii="Arial" w:hAnsi="Arial" w:cs="Arial"/>
+          <w:sz w:val="22"/>
+          <w:szCs w:val="22"/>
+        </w:rPr>
+        <w:t>en</w:t>
+      </w:r>
+      <w:r>
+        <w:rPr>
+          <w:rFonts w:ascii="Arial" w:hAnsi="Arial" w:cs="Arial"/>
+          <w:sz w:val="22"/>
+          <w:szCs w:val="22"/>
+        </w:rPr>
+        <w:t xml:space="preserve"> diese mithilfe eines </w:t>
       </w:r>
       <w:proofErr w:type="spellStart"/>
       <w:r>
@@ -898,7 +915,23 @@
           <w:sz w:val="22"/>
           <w:szCs w:val="22"/>
         </w:rPr>
-        <w:t xml:space="preserve">, während der reale Spieler seine Emotionen wahrt, um dem Gegner keine Schwäche zu zeigen. Bei der Ausarbeitung dieses Ansatzes zeigten sich jedoch einige konzeptionelle und technische Hürden. Die Komplexität des genauen Trackings des Schachbretts und der Züge sprengten den Rahmen des Projekts. Außerdem gab es Defizite im Raumkontext, da sich die Installation nicht lückenlos in die Umgebung des Raums einfügte. Auch das Setting entsprach nicht dem Leitfaden einer intuitiven Raumerfahrung, weswegen die Interaktion erzwungen gewirkt hätte, da sich Teilnehmer erst aktiv an das Schachbrett setzen und spielen hätten müssen. </w:t>
+        <w:t xml:space="preserve">, während der reale Spieler seine Emotionen wahrt, um dem Gegner keine Schwäche zu zeigen. Bei der Ausarbeitung dieses Ansatzes zeigten sich jedoch einige konzeptionelle und technische Hürden. Die Komplexität des genauen Trackings des Schachbretts und der Züge sprengte den Rahmen des Projekts. Außerdem gab es Defizite im Raumkontext, da sich die Installation nicht lückenlos in die Umgebung des Raums einfügte. Auch das Setting entsprach nicht dem Leitfaden einer intuitiven Raumerfahrung, weswegen die Interaktion erzwungen gewirkt hätte, da sich Teilnehmer erst aktiv an das Schachbrett </w:t>
+      </w:r>
+      <w:r>
+        <w:rPr>
+          <w:rFonts w:ascii="Arial" w:hAnsi="Arial" w:cs="Arial"/>
+          <w:sz w:val="22"/>
+          <w:szCs w:val="22"/>
+        </w:rPr>
+        <w:t xml:space="preserve">hätten </w:t>
+      </w:r>
+      <w:r>
+        <w:rPr>
+          <w:rFonts w:ascii="Arial" w:hAnsi="Arial" w:cs="Arial"/>
+          <w:sz w:val="22"/>
+          <w:szCs w:val="22"/>
+        </w:rPr>
+        <w:t xml:space="preserve">setzen und spielen müssen. </w:t>
       </w:r>
       <w:r>
         <w:rPr>
@@ -1369,6 +1402,39 @@
       <w:pPr>
         <w:rPr>
           <w:rFonts w:ascii="Arial" w:hAnsi="Arial" w:cs="Arial"/>
+          <w:sz w:val="22"/>
+          <w:szCs w:val="22"/>
+        </w:rPr>
+      </w:pPr>
+      <w:r>
+        <w:rPr>
+          <w:rFonts w:ascii="Arial" w:hAnsi="Arial" w:cs="Arial"/>
+          <w:sz w:val="22"/>
+          <w:szCs w:val="22"/>
+        </w:rPr>
+        <w:t>Zu Beginn wurden alle Bewegungssequenzen direkt im Arbeitsspeicher des Browsers abgelegt. Um Browserabstürze durch RAM-Überlastung zu verhindern, haben wir das Sy</w:t>
+      </w:r>
+      <w:r>
+        <w:rPr>
+          <w:rFonts w:ascii="Arial" w:hAnsi="Arial" w:cs="Arial"/>
+          <w:sz w:val="22"/>
+          <w:szCs w:val="22"/>
+        </w:rPr>
+        <w:t>s</w:t>
+      </w:r>
+      <w:r>
+        <w:rPr>
+          <w:rFonts w:ascii="Arial" w:hAnsi="Arial" w:cs="Arial"/>
+          <w:sz w:val="22"/>
+          <w:szCs w:val="22"/>
+        </w:rPr>
+        <w:t xml:space="preserve">tem im weiteren Verlauf so umstrukturiert, dass die Sequenzen auf der Festplatte gespeichert werden. </w:t>
+      </w:r>
+    </w:p>
+    <w:p>
+      <w:pPr>
+        <w:rPr>
+          <w:rFonts w:ascii="Arial" w:hAnsi="Arial" w:cs="Arial"/>
           <w:b/>
           <w:bCs/>
           <w:sz w:val="28"/>
@@ -1418,15 +1484,15 @@
           <w:sz w:val="22"/>
           <w:szCs w:val="22"/>
         </w:rPr>
-        <w:t>-Box (</w:t>
-      </w:r>
-      <w:r>
-        <w:rPr>
-          <w:rFonts w:ascii="Arial" w:hAnsi="Arial" w:cs="Arial"/>
-          <w:sz w:val="22"/>
-          <w:szCs w:val="22"/>
-        </w:rPr>
-        <w:t>MIN_DEPTH =1, MAX_DEPTH = 2075</w:t>
+        <w:t>-Box (MIN_DEPTH =1, MAX_DEPTH = 2</w:t>
+      </w:r>
+      <w:r>
+        <w:rPr>
+          <w:rFonts w:ascii="Arial" w:hAnsi="Arial" w:cs="Arial"/>
+          <w:sz w:val="22"/>
+          <w:szCs w:val="22"/>
+        </w:rPr>
+        <w:t>100</w:t>
       </w:r>
       <w:r>
         <w:rPr>
@@ -1478,7 +1544,49 @@
           <w:sz w:val="22"/>
           <w:szCs w:val="22"/>
         </w:rPr>
-        <w:t xml:space="preserve"> als stark komprimiertes JPEG-Bild encodiert. Anschließend wird dieses in einen Base64-String umgewandelt und mit einem Limit von 30 FPS an das Frontend gesendet. </w:t>
+        <w:t xml:space="preserve"> </w:t>
+      </w:r>
+      <w:r>
+        <w:rPr>
+          <w:rFonts w:ascii="Arial" w:hAnsi="Arial" w:cs="Arial"/>
+          <w:sz w:val="22"/>
+          <w:szCs w:val="22"/>
+        </w:rPr>
+        <w:lastRenderedPageBreak/>
+        <w:t xml:space="preserve">als stark komprimiertes JPEG-Bild encodiert. Anschließend wird dieses in einen Base64-String umgewandelt und mit einem Limit von 30 FPS an das Frontend gesendet. </w:t>
+      </w:r>
+    </w:p>
+    <w:p>
+      <w:pPr>
+        <w:rPr>
+          <w:rFonts w:ascii="Arial" w:hAnsi="Arial" w:cs="Arial"/>
+          <w:sz w:val="22"/>
+          <w:szCs w:val="22"/>
+        </w:rPr>
+      </w:pPr>
+      <w:r>
+        <w:rPr>
+          <w:rFonts w:ascii="Arial" w:hAnsi="Arial" w:cs="Arial"/>
+          <w:sz w:val="22"/>
+          <w:szCs w:val="22"/>
+        </w:rPr>
+        <w:t>Zusätzlich übernimmt das Python-Backend die Dateiverwaltung. Es empfängt die vom Frontend aufgezeichneten Sequenzen als JSON-Nachricht und speichert die einzelnen Frames lokal auf der Festplatte. Zudem sucht das Backend zufällig vollständige Geister</w:t>
+      </w:r>
+      <w:r>
+        <w:rPr>
+          <w:rFonts w:ascii="Arial" w:hAnsi="Arial" w:cs="Arial"/>
+          <w:sz w:val="22"/>
+          <w:szCs w:val="22"/>
+        </w:rPr>
+        <w:t>-</w:t>
+      </w:r>
+      <w:r>
+        <w:rPr>
+          <w:rFonts w:ascii="Arial" w:hAnsi="Arial" w:cs="Arial"/>
+          <w:sz w:val="22"/>
+          <w:szCs w:val="22"/>
+        </w:rPr>
+        <w:t>Sequenzen und streamt diese zurück an das p5.js-Frontend.</w:t>
       </w:r>
     </w:p>
     <w:p>
@@ -1510,7 +1618,6 @@
           <w:sz w:val="28"/>
           <w:szCs w:val="28"/>
         </w:rPr>
-        <w:lastRenderedPageBreak/>
         <w:t xml:space="preserve">4.2 p5.js-Frontend </w:t>
       </w:r>
     </w:p>
@@ -1598,33 +1705,63 @@
           <w:sz w:val="22"/>
           <w:szCs w:val="22"/>
         </w:rPr>
-        <w:t xml:space="preserve">überschritten wird, weiß unser System ressourcenschonend, dass sich eine Person im Bild befindet. Außerdem speichern wir nur jeden zweiten Frame, was den Speicherbedarf direkt halbiert, uns aber trotzdem noch flüssige Bewegungen liefert. </w:t>
-      </w:r>
-      <w:r>
-        <w:rPr>
-          <w:rFonts w:ascii="Arial" w:hAnsi="Arial" w:cs="Arial"/>
-          <w:sz w:val="22"/>
-          <w:szCs w:val="22"/>
-        </w:rPr>
-        <w:t xml:space="preserve">Des </w:t>
-      </w:r>
-      <w:proofErr w:type="spellStart"/>
-      <w:r>
-        <w:rPr>
-          <w:rFonts w:ascii="Arial" w:hAnsi="Arial" w:cs="Arial"/>
-          <w:sz w:val="22"/>
-          <w:szCs w:val="22"/>
-        </w:rPr>
-        <w:t>Weiteren</w:t>
-      </w:r>
-      <w:proofErr w:type="spellEnd"/>
-      <w:r>
-        <w:rPr>
-          <w:rFonts w:ascii="Arial" w:hAnsi="Arial" w:cs="Arial"/>
-          <w:sz w:val="22"/>
-          <w:szCs w:val="22"/>
-        </w:rPr>
-        <w:t xml:space="preserve"> definieren wir harte Speicherlimits. Die Live-Aufnahme (</w:t>
+        <w:t>überschritten wird, weiß unser System ressourcenschonend, dass sich eine Person im Bild befindet.</w:t>
+      </w:r>
+      <w:r>
+        <w:rPr>
+          <w:rFonts w:ascii="Arial" w:hAnsi="Arial" w:cs="Arial"/>
+          <w:sz w:val="22"/>
+          <w:szCs w:val="22"/>
+        </w:rPr>
+        <w:t xml:space="preserve"> </w:t>
+      </w:r>
+      <w:r>
+        <w:rPr>
+          <w:rFonts w:ascii="Arial" w:hAnsi="Arial" w:cs="Arial"/>
+          <w:sz w:val="22"/>
+          <w:szCs w:val="22"/>
+        </w:rPr>
+        <w:t xml:space="preserve">Die wichtigste Optimierung betrifft jedoch </w:t>
+      </w:r>
+      <w:r>
+        <w:rPr>
+          <w:rFonts w:ascii="Arial" w:hAnsi="Arial" w:cs="Arial"/>
+          <w:sz w:val="22"/>
+          <w:szCs w:val="22"/>
+        </w:rPr>
+        <w:t>das Speichermanagement der Geister-Sequenzen. Verlässt eine Person den Erfassungsbereich</w:t>
+      </w:r>
+      <w:r>
+        <w:rPr>
+          <w:rFonts w:ascii="Arial" w:hAnsi="Arial" w:cs="Arial"/>
+          <w:sz w:val="22"/>
+          <w:szCs w:val="22"/>
+        </w:rPr>
+        <w:t xml:space="preserve">, </w:t>
+      </w:r>
+      <w:r>
+        <w:rPr>
+          <w:rFonts w:ascii="Arial" w:hAnsi="Arial" w:cs="Arial"/>
+          <w:sz w:val="22"/>
+          <w:szCs w:val="22"/>
+        </w:rPr>
+        <w:t xml:space="preserve">werden die Frames in Base64-kodierte Bilder konvertiert und an das Python-Backend gesendet. Das Frontend fordert in zufälligen Abständen einen dieser gespeicherten Geister vom Server an. Damit der performative Raum beim Start der Anwendung nicht leer ist und der Effekt direkt funktioniert, haben wir im </w:t>
+      </w:r>
+      <w:r>
+        <w:rPr>
+          <w:rFonts w:ascii="Arial" w:hAnsi="Arial" w:cs="Arial"/>
+          <w:sz w:val="22"/>
+          <w:szCs w:val="22"/>
+        </w:rPr>
+        <w:t>Vorhinein</w:t>
+      </w:r>
+      <w:r>
+        <w:rPr>
+          <w:rFonts w:ascii="Arial" w:hAnsi="Arial" w:cs="Arial"/>
+          <w:sz w:val="22"/>
+          <w:szCs w:val="22"/>
+        </w:rPr>
+        <w:t xml:space="preserve"> schon vier Sequenzen aufgenommen und in der </w:t>
       </w:r>
       <w:proofErr w:type="spellStart"/>
       <w:r>
@@ -1635,18 +1772,9 @@
           <w:sz w:val="22"/>
           <w:szCs w:val="22"/>
         </w:rPr>
-        <w:t>currentSequence</w:t>
+        <w:t>memoryBank</w:t>
       </w:r>
       <w:proofErr w:type="spellEnd"/>
-      <w:r>
-        <w:rPr>
-          <w:rFonts w:ascii="Arial" w:hAnsi="Arial" w:cs="Arial"/>
-          <w:sz w:val="22"/>
-          <w:szCs w:val="22"/>
-        </w:rPr>
-        <w:t xml:space="preserve">) wird auf 60 Frames gedeckelt und unsere </w:t>
-      </w:r>
-      <w:proofErr w:type="spellStart"/>
       <w:r>
         <w:rPr>
           <w:rFonts w:ascii="Arial" w:hAnsi="Arial" w:cs="Arial"/>
@@ -1655,17 +1783,6 @@
           <w:sz w:val="22"/>
           <w:szCs w:val="22"/>
         </w:rPr>
-        <w:t>memoryBank</w:t>
-      </w:r>
-      <w:proofErr w:type="spellEnd"/>
-      <w:r>
-        <w:rPr>
-          <w:rFonts w:ascii="Arial" w:hAnsi="Arial" w:cs="Arial"/>
-          <w:i/>
-          <w:iCs/>
-          <w:sz w:val="22"/>
-          <w:szCs w:val="22"/>
-        </w:rPr>
         <w:t xml:space="preserve"> </w:t>
       </w:r>
       <w:r>
@@ -1674,31 +1791,7 @@
           <w:sz w:val="22"/>
           <w:szCs w:val="22"/>
         </w:rPr>
-        <w:t xml:space="preserve">speichert die letzten </w:t>
-      </w:r>
-      <w:r>
-        <w:rPr>
-          <w:rFonts w:ascii="Arial" w:hAnsi="Arial" w:cs="Arial"/>
-          <w:sz w:val="22"/>
-          <w:szCs w:val="22"/>
-        </w:rPr>
-        <w:t>acht</w:t>
-      </w:r>
-      <w:r>
-        <w:rPr>
-          <w:rFonts w:ascii="Arial" w:hAnsi="Arial" w:cs="Arial"/>
-          <w:sz w:val="22"/>
-          <w:szCs w:val="22"/>
-        </w:rPr>
-        <w:t xml:space="preserve"> Sequenzen</w:t>
-      </w:r>
-      <w:r>
-        <w:rPr>
-          <w:rFonts w:ascii="Arial" w:hAnsi="Arial" w:cs="Arial"/>
-          <w:sz w:val="22"/>
-          <w:szCs w:val="22"/>
-        </w:rPr>
-        <w:t>.</w:t>
+        <w:t xml:space="preserve">hinterlegt. </w:t>
       </w:r>
     </w:p>
     <w:p>
@@ -1715,27 +1808,7 @@
           <w:sz w:val="22"/>
           <w:szCs w:val="22"/>
         </w:rPr>
-        <w:t xml:space="preserve">Sobald eine Person den Erfassungsbereich verlässt, wird die aktuelle Sequenz in die </w:t>
-      </w:r>
-      <w:proofErr w:type="spellStart"/>
-      <w:r>
-        <w:rPr>
-          <w:rFonts w:ascii="Arial" w:hAnsi="Arial" w:cs="Arial"/>
-          <w:i/>
-          <w:iCs/>
-          <w:sz w:val="22"/>
-          <w:szCs w:val="22"/>
-        </w:rPr>
-        <w:t>memoryBank</w:t>
-      </w:r>
-      <w:proofErr w:type="spellEnd"/>
-      <w:r>
-        <w:rPr>
-          <w:rFonts w:ascii="Arial" w:hAnsi="Arial" w:cs="Arial"/>
-          <w:sz w:val="22"/>
-          <w:szCs w:val="22"/>
-        </w:rPr>
-        <w:t xml:space="preserve"> verschoben und steht als Gedächtnis zur Verfügung. Die abgespeicherten Sequenzen verwalten wir objektorientiert in einer Ghost-Klasse. Jeder Geist erhält eine zufällige Lifetime</w:t>
+        <w:t>Die abgespeicherten Sequenzen verwalten wir objektorientiert in einer Ghost-Klasse. Jeder Geist erhält eine zufällige Lifetime</w:t>
       </w:r>
       <w:r>
         <w:rPr>
@@ -2010,7 +2083,32 @@
           <w:sz w:val="22"/>
           <w:szCs w:val="22"/>
         </w:rPr>
-        <w:t xml:space="preserve">nsbesondere die Aufrechterhaltung einer stabilen Performance im Webbrowser, da die ununterbrochenen Bitströme den RAM bei der Zwischenspeicherung schnell zu überfordern drohten. Zusätzlich entsprachen die rohen Bilddaten der Kinect anfangs nicht unseren ästhetischen Vorstellungen. Erst durch die Fischaugen-Entzerrung und </w:t>
+        <w:t xml:space="preserve">nsbesondere die Aufrechterhaltung einer stabilen Performance im Webbrowser, da die ununterbrochenen Bitströme den RAM bei der Zwischenspeicherung </w:t>
+      </w:r>
+      <w:r>
+        <w:rPr>
+          <w:rFonts w:ascii="Arial" w:hAnsi="Arial" w:cs="Arial"/>
+          <w:sz w:val="22"/>
+          <w:szCs w:val="22"/>
+        </w:rPr>
+        <w:lastRenderedPageBreak/>
+        <w:t xml:space="preserve">schnell zu überfordern drohten. </w:t>
+      </w:r>
+      <w:r>
+        <w:rPr>
+          <w:rFonts w:ascii="Arial" w:hAnsi="Arial" w:cs="Arial"/>
+          <w:sz w:val="22"/>
+          <w:szCs w:val="22"/>
+        </w:rPr>
+        <w:t xml:space="preserve">Das konnten wir final bewältigen, indem wir die Speicherung der Sequenzen komplett auf die Festplatte ausgelagert haben. </w:t>
+      </w:r>
+      <w:r>
+        <w:rPr>
+          <w:rFonts w:ascii="Arial" w:hAnsi="Arial" w:cs="Arial"/>
+          <w:sz w:val="22"/>
+          <w:szCs w:val="22"/>
+        </w:rPr>
+        <w:t xml:space="preserve">Zusätzlich entsprachen die rohen Bilddaten der Kinect anfangs nicht unseren ästhetischen Vorstellungen. Erst durch die Fischaugen-Entzerrung und </w:t>
       </w:r>
       <w:r>
         <w:rPr>
@@ -2180,7 +2278,6 @@
           <w:sz w:val="22"/>
           <w:szCs w:val="22"/>
         </w:rPr>
-        <w:lastRenderedPageBreak/>
         <w:t>Würden wir das Projekt noch fortführen, läge unser Fokus auf weiteren Interaktionsmöglichkeiten. Ein</w:t>
       </w:r>
       <w:r>
@@ -2314,6 +2411,7 @@
         </w:rPr>
         <w:t xml:space="preserve"> </w:t>
       </w:r>
+      <w:bookmarkEnd w:id="0"/>
     </w:p>
     <w:sectPr>
       <w:headerReference w:type="first" r:id="rId7"/>

</xml_diff>